<commit_message>
Makale (EN/TR): Mode B sonuclari UTC duzeltmesine gore guncellendi; donem ayrimi, Brier/kalibrasyon ve Mode B yapilandirma duyarlilik analizi eklendi
Ozet, Bolum 3.2/4.1/4.4/4.5/5/6, Tablo 5/7/8/9/11-16 ve Sekil 6-16 yeni Mode B sonuclariyla guncellendi. 19b_modeB_config_sensitivity.py ve ciktisi eklendi.
</commit_message>
<xml_diff>
--- a/Proje raporu/Bitirme-Dergi-Revizyon-TR.docx
+++ b/Proje raporu/Bitirme-Dergi-Revizyon-TR.docx
@@ -1912,7 +1912,7 @@
           <w:w w:val="110"/>
           <w:sz w:val="14"/>
         </w:rPr>
-        <w:t xml:space="preserve">Uçuş iptalleri ve gecikmeleri yolcular ve havayolları için ağır bir yük oluşturmaktadır; buna karşın yayımlanan tahmin modelleri çoğunlukla yeniden dengelenmiş verilerle, sızıntılı özelliklerle veya dengesiz hedeflerde doğruluk ölçütüyle değerlendirilmekte ve bu durum zayıf başarımı gizlemektedir. Bu çalışmada, 3,58 milyon ABD iç hat uçuşu (Ocak 2019 – Ağustos 2023 ve Ocak 2024) üzerinde üç ayrı çıktıyı tahmin ediyoruz: uçuş iptali, iptal nedeni (havayolu, hava durumu, ulusal hava sistemi) ve dört sınıflı kalkış gecikmesi. XGBoost modelleri takvim ve tarife bilgilerini, bir önceki gün gözlemlenen hava durumunu (Meteostat), yakın dönemdeki iptal ve gecikme oranlarını ve isteğe bağlı kalkış günü modunda kalkıştan üç saat önceki operasyonel durumu kullanmaktadır. Eğitim (2019-01 – 2022-06) dönemini rastgele arama ile hiperparametre ayarı ve eşik seçimi (2022-07 – 2022-12) izlemekte; model, doğal sınıf dağılımıyla 2023-01 – 2023-08 ve 2024-01 dönemlerinde yalnızca bir kez test edilmektedir; nihai modellerde yeniden örnekleme kullanılmamıştır. İptal PR-AUC değeri bir önceki güne ait bilgiyle 0,119 (ROC-AUC 0,800), gün içi durumla 0,196 (0,857) olup bilgisiz taban düzeyi 0,029'dur. İptal nedeni doğruluğu %70,7 ve %73,9 (çoğunluk sınıfı tabanı %60,2); dört sınıflı gecikme doğruluğu %60,8 ve %61,9 (taban %60,0) olup 15 dakikayı aşan gecikmeler için ROC-AUC 0,693 ve 0,721'dir. Ablasyon deneyleri, kazancın büyük bölümünü hava durumunun değil yakın dönem operasyonel geçmişin sağladığını, başarımın aylar arasında güçlü biçimde değiştiğini göstermektedir. SHAP analizi, iptal tahmininde belirleyici girdilerin havayolu bazlı yakın dönem iptal oranları olduğunu ortaya koymaktadır. İptal uyarıları, kaçırılan bir iptalin maliyeti yanlış alarmın yaklaşık on katı veya daha fazlası olduğunda kazanç sağlamakta; dolayısıyla modeller kesin birer öngörü değil, risk göstergeleridir. SmartTicket prototipi bu göstergeleri bilet aramasında sunmaktadır; kullanıcı doğrulaması gelecek çalışmaya bırakılmıştır.</w:t>
+        <w:t xml:space="preserve">Uçuş iptalleri ve gecikmeleri yolcular ve havayolları için ağır bir yük oluşturmaktadır; buna karşın yayımlanan tahmin modelleri çoğunlukla yeniden dengelenmiş verilerle, sızıntılı özelliklerle veya dengesiz hedeflerde doğruluk ölçütüyle değerlendirilmekte ve bu durum zayıf başarımı gizlemektedir. Bu çalışmada, 3,58 milyon ABD iç hat uçuşu (Ocak 2019 – Ağustos 2023 ve Ocak 2024) üzerinde üç ayrı çıktıyı tahmin ediyoruz: uçuş iptali, iptal nedeni (havayolu, hava durumu, ulusal hava sistemi) ve dört sınıflı kalkış gecikmesi. XGBoost modelleri takvim ve tarife bilgilerini, bir önceki gün gözlemlenen hava durumunu (Meteostat), yakın dönemdeki iptal ve gecikme oranlarını ve isteğe bağlı kalkış günü modunda kalkıştan üç saat önceki operasyonel durumu kullanmaktadır. Eğitim (2019-01 – 2022-06) dönemini rastgele arama ile hiperparametre ayarı ve eşik seçimi (2022-07 – 2022-12) izlemekte; model, doğal sınıf dağılımıyla 2023-01 – 2023-08 ve 2024-01 dönemlerinde yalnızca bir kez test edilmektedir; nihai modellerde yeniden örnekleme kullanılmamıştır. İptal PR-AUC değeri bir önceki güne ait bilgiyle 0,119 (ROC-AUC 0,800), gün içi durumla 0,180 (0,849) olup bilgisiz taban düzeyi 0,029'dur. İptal nedeni doğruluğu %70,7 ve %75,0 (çoğunluk sınıfı tabanı %60,2); dört sınıflı gecikme doğruluğu %60,8 ve %61,9 (taban %60,0) olup 15 dakikayı aşan gecikmeler için ROC-AUC 0,693 ve 0,721'dir. Ablasyon deneyleri, kazancın büyük bölümünü hava durumunun değil yakın dönem operasyonel geçmişin sağladığını, başarımın aylar arasında güçlü biçimde değiştiğini göstermektedir. SHAP analizi, iptal tahmininde belirleyici girdilerin havayolu bazlı yakın dönem iptal oranları olduğunu ortaya koymaktadır. İptal uyarıları, kaçırılan bir iptalin maliyeti yanlış alarmın yaklaşık on katı veya daha fazlası olduğunda kazanç sağlamakta; dolayısıyla modeller kesin birer öngörü değil, risk göstergeleridir. SmartTicket prototipi bu göstergeleri bilet aramasında sunmaktadır; kullanıcı doğrulaması gelecek çalışmaya bırakılmıştır.</w:t>
       </w:r>
     </w:p>
     <w:p>
@@ -13330,7 +13330,7 @@
         <w:rPr>
           <w:w w:val="110"/>
         </w:rPr>
-        <w:t xml:space="preserve">2. Aşama – kalkıştan önce bilinen özellikler: yalnızca olaydan sonra bilinen değişkenler (gerçekleşen kalkış ve varış saatleri, taksi, tekerlek, geçen ve havada kalma süreleri, gecikme nedenleri) uçuş numarası ve takvim yılı gibi dışlanmıştır. Takvim ve tarife: ay ve yılın günü (sinüs/kosinüs), haftanın günü, en yakın ABD federal tatiline kalan ve geçen gün sayısı, tarifeli kalkış ve varış dakikası, mesafe ve rotadaki eğitim dönemi uçuş sayısının logaritması. Kategorik: havayolu, kalkış ve varış havalimanı (doğal kategorik işleme; eğitim döneminde görülmeyen kategoriler eksik olarak ele alınır). Hava durumu: kalkıştaki yedi D-1 değişkeni ve varışta sıcaklık, yağış, kar ve rüzgâr. Geçmiş (Mod A ve B): bir önceki günün (D-1) ve önceki yedi günün iptal oranı, 15 dakikadan fazla geciken kalkışların payı ve ortalama kalkış gecikmesi (-30..180 dakikaya kırpılmış); ülke genelinde, kalkış havalimanı bazında ve havayolu bazında; iki oran 30 sözde uçuşla eğitim dönemi önsellerine doğru daraltılmıştır. Gün içi durum (yalnızca Mod B): olayları tarifeli kalkıştan en az üç saat önce gerçekleşmiş aynı gün uçuşları için aynı üç istatistik ve o ana kadar tarifelenmiş uçuşlardan henüz kalkmamış olanların payı. Tam özellik kümesi Tablo 5'te listelenmiştir; üç görev aynı girdileri kullanır (Mod A'da 44, Mod B'de 56).</w:t>
+        <w:t xml:space="preserve">2. Aşama – kalkıştan önce bilinen özellikler: yalnızca olaydan sonra bilinen değişkenler (gerçekleşen kalkış ve varış saatleri, taksi, tekerlek, geçen ve havada kalma süreleri, gecikme nedenleri) uçuş numarası ve takvim yılı gibi dışlanmıştır. Takvim ve tarife: ay ve yılın günü (sinüs/kosinüs), haftanın günü, en yakın ABD federal tatiline kalan ve geçen gün sayısı, tarifeli kalkış ve varış dakikası, mesafe ve rotadaki eğitim dönemi uçuş sayısının logaritması. Kategorik: havayolu, kalkış ve varış havalimanı (doğal kategorik işleme; eğitim döneminde görülmeyen kategoriler eksik olarak ele alınır). Hava durumu: kalkıştaki yedi D-1 değişkeni ve varışta sıcaklık, yağış, kar ve rüzgâr. Geçmiş (Mod A ve B): bir önceki günün (D-1) ve önceki yedi günün iptal oranı, 15 dakikadan fazla geciken kalkışların payı ve ortalama kalkış gecikmesi (-30..180 dakikaya kırpılmış); ülke genelinde, kalkış havalimanı bazında ve havayolu bazında; iki oran 30 sözde uçuşla eğitim dönemi önsellerine doğru daraltılmıştır. Gün içi durum (yalnızca Mod B): olayları tarifeli kalkıştan en az üç saat önce gerçekleşmiş aynı gün uçuşları için aynı üç istatistik ve o ana kadar tarifelenmiş uçuşlardan henüz kalkmamış olanların payı. Tüm gün içi istatistikler mutlak bir zaman ekseninde hesaplanır: BTS'nin yerel tarifeli saatleri kalkış havalimanının saat dilimiyle (yaz saati uygulaması dahil) UTC'ye çevrilir, kesim anı UTC'de tarifeli kalkıştan üç saat öncesidir ve diğer havalimanlarının olayları bu kesim anıyla mutlak zamanda karşılaştırılır; gün içi pencere uçuşun kendi tarihinin yerel gece yarısında başlar. Bir olay tarifeli kalkış gününe aittir, bir iptal iptal edilen uçuşun tarifeli kalkışında bilinmiş sayılır ve yerel gece yarısından sonraki ilk üç saat içinde tarifelenen uçuşlar için gün içi bilgi yoktur (eğitim dönemi önsel değerleri kullanılır). Tam özellik kümesi Tablo 5'te listelenmiştir; üç görev aynı girdileri kullanır (Mod A'da 44, Mod B'de 56).</w:t>
       </w:r>
     </w:p>
     <w:p>
@@ -14959,7 +14959,7 @@
                 <w:szCs w:val="12"/>
                 <w:lang w:val="en-US"/>
               </w:rPr>
-              <w:t xml:space="preserve">Kesim anından (tarifeli kalkış eksi 3 sa) önce tarifelenen uçuşlardan iptal edilenlerin payı</w:t>
+              <w:t xml:space="preserve">Kesim anından (tarifeli kalkış eksi 3 sa; UTC'de karşılaştırılır) önce tarifelenen uçuşlardan iptal edilenlerin payı</w:t>
             </w:r>
           </w:p>
         </w:tc>
@@ -15385,7 +15385,7 @@
         <w:rPr>
           <w:w w:val="110"/>
         </w:rPr>
-        <w:t xml:space="preserve">Sızıntı denetimi: geçmiş ve gün içi özellikleri iki otomatik test korumaktadır. Birincisinde bir takvim gününün etiketleri ve gecikmeleri değiştirilir; o günün özellikleri değişmeden kalmalı, ertesi günün özellikleri ise değişmelidir. İkincisinde 300 hedef uçuş için kesim saatinden sonraki her olay ve uçuşun kendisi değiştirilir; gün içi özellikler değişmeden kalmalıdır. Her iki test de kod tabanının parçasıdır. Daraltma (shrinkage) için kullanılan önsel oranlar eğitim döneminden sabitlenmiştir.</w:t>
+        <w:t xml:space="preserve">Sızıntı denetimi: geçmiş ve gün içi özellikleri iki otomatik test korumaktadır. Birincisinde bir takvim gününün etiketleri ve gecikmeleri değiştirilir; o günün özellikleri değişmeden kalmalı, ertesi günün özellikleri ise değişmelidir. İkincisinde 300 hedef uçuş için kesim saatinden sonraki her olay ve uçuşun kendisi değiştirilir; gün içi özellikler değişmeden kalmalıdır; bu ikinci test, tüm saat dilimlerinden uçuşlar için mutlak zaman ekseninde çalıştırılır. Her iki test de kod tabanının parçasıdır. Daraltma (shrinkage) için kullanılan önsel oranlar eğitim döneminden sabitlenmiştir.</w:t>
       </w:r>
     </w:p>
     <w:p>
@@ -18015,7 +18015,7 @@
         <w:rPr>
           <w:w w:val="110"/>
         </w:rPr>
-        <w:t xml:space="preserve">Uçuş iptali nadir bir olaydır (test döneminde yaygınlık %2,86). İkili XGBoost modeli test PR-AUC değerine Mod A'da 0,119 (0,116-0,122), ROC-AUC değerine 0,800; Mod B'de ise sırasıyla 0,196 (0,191-0,200) ve 0,857 değerlerine ulaşmıştır; bu, bilgisiz PR-AUC taban değerinin 4,2 ve 6,8 katıdır (Bölüm 4.5.1).</w:t>
+        <w:t xml:space="preserve">Uçuş iptali nadir bir olaydır (test döneminde yaygınlık %2,86). İkili XGBoost modeli test PR-AUC değerine Mod A'da 0,119 (0,116-0,122), ROC-AUC değerine 0,800; Mod B'de ise sırasıyla 0,180 (0,177-0,184) ve 0,849 değerlerine ulaşmıştır; bu, bilgisiz PR-AUC taban değerinin 4,2 ve 6,3 katıdır (Bölüm 4.5.1).</w:t>
       </w:r>
     </w:p>
     <w:p>
@@ -18032,7 +18032,7 @@
         <w:rPr>
           <w:w w:val="110"/>
         </w:rPr>
-        <w:t xml:space="preserve">Doğrulama döneminde F1'i en büyükleyen karar eşiğiyle (Mod A'da 0,149 ve Mod B'de 0,156) Mod B, iptal edilen uçuşların %36,8'ini %20,9 kesinlikle yakalamaktadır (F1 0,266, makro-F1 0,618, dengeli doğruluk 0,664); Mod A %17,9'unu %16,9 kesinlikle yakalamaktadır (F1 0,174, makro-F1 0,575). Dolayısıyla alarmların çoğu yanlıştır: Mod B'de işaretlenen her beş uçuşun yaklaşık dördü iptal edilmemektedir. Tablo 7, üç görevin her iki moddaki sınıf bazlı kesinlik, duyarlılık ve F1 değerlerini vermektedir.</w:t>
+        <w:t xml:space="preserve">Doğrulama döneminde F1'i en büyükleyen karar eşiğiyle (Mod A'da 0,149 ve Mod B'de 0,855; sınıf ağırlıklı Mod B skorları kalibre olasılıklar değildir) Mod B, iptal edilen uçuşların %31,9'unu %22,2 kesinlikle yakalamaktadır (F1 0,262, makro-F1 0,618, dengeli doğruluk 0,643); Mod A %17,9'unu %16,9 kesinlikle yakalamaktadır (F1 0,174, makro-F1 0,575). Dolayısıyla alarmların çoğu yanlıştır: Mod B'de işaretlenen her beş uçuşun yaklaşık dördü iptal edilmemektedir. Tablo 7, üç görevin her iki moddaki sınıf bazlı kesinlik, duyarlılık ve F1 değerlerini vermektedir.</w:t>
       </w:r>
     </w:p>
     <w:p>
@@ -18049,7 +18049,7 @@
         <w:rPr>
           <w:w w:val="110"/>
         </w:rPr>
-        <w:t xml:space="preserve">Bu eşiklerdeki genel doğruluk %95,1 (Mod A) ve %94,2'dir (Mod B); bu değer, her uçuş için 'iptal edilmedi' tahmin etmekle elde edilen %97,1'in altındadır. Bu nedenle doğruluk bu görev için anlamlı bir ölçüt değildir ve nadir olay hedeflerinde bildirilen yüksek doğruluk değerleri dikkatle okunmalıdır.</w:t>
+        <w:t xml:space="preserve">Bu eşiklerdeki genel doğruluk %95,1 (Mod A) ve %94,9'dur (Mod B); bu değer, her uçuş için 'iptal edilmedi' tahmin etmekle elde edilen %97,1'in altındadır. Bu nedenle doğruluk bu görev için anlamlı bir ölçüt değildir ve nadir olay hedeflerinde bildirilen yüksek doğruluk değerleri dikkatle okunmalıdır.</w:t>
       </w:r>
     </w:p>
     <w:p>
@@ -18066,7 +18066,24 @@
         <w:rPr>
           <w:w w:val="110"/>
         </w:rPr>
-        <w:t xml:space="preserve">Test dönemi 1.045.909 uçuş içermekte olup bunların 29.882'si iptal edilmiştir. Mod B'de doğrulama eşiğindeki karışıklık matrisi TN 974.281, FP 41.746, FN 18.872, TP 11.010'dur (Şekil 9). ROC ve kesinlik-duyarlılık eğrileri Şekil 10 ve 11'de gösterilmiştir.</w:t>
+        <w:t xml:space="preserve">Test dönemi 1.045.909 uçuş içermekte olup bunların 29.882'si iptal edilmiştir. Mod B'de doğrulama eşiğindeki karışıklık matrisi TN 982.656, FP 33.371, FN 20.335, TP 9.547'dur (Şekil 9). ROC ve kesinlik-duyarlılık eğrileri Şekil 10 ve 11'de gösterilmiştir.</w:t>
+      </w:r>
+    </w:p>
+    <w:p>
+      <w:pPr>
+        <w:pStyle w:val="GvdeMetni"/>
+        <w:spacing w:line="273" w:lineRule="auto"/>
+        <w:ind w:left="43" w:right="183" w:firstLine="239"/>
+        <w:jc w:val="both"/>
+        <w:rPr>
+          <w:w w:val="110"/>
+        </w:rPr>
+      </w:pPr>
+      <w:r>
+        <w:rPr>
+          <w:w w:val="110"/>
+        </w:rPr>
+        <w:t xml:space="preserve">Olasılıkların kalitesi (Mod A, test dönemi): Brier skoru 0,0266, test yaygınlığını sabit olarak tahmin etmenin Brier skoru ise 0,0278'dir (Brier beceri skoru %4,2); ortalama tahmin edilen olasılık (%2,91) gözlenen iptal oranıyla (%2,86) örtüşmektedir. Kalibrasyon eğrisi (depodaki outputs/figures/calibration_cancel.png) yaklaşık %10'a kadar olan tahmin olasılıklarında köşegeni izlemektedir; en yüksek riskli onda birlik uçuş diliminde ortalama tahmin edilen olasılık %14,2, gözlenen oran %12,6'dır. Kalibrasyon eğimi 2023 aylarında 1,02, Ocak 2024'te 0,81'dir (genel 0,88); yani yaygınlık doğrulama dönemindekinden (%2,16) yüksek olduğunda model hafifçe aşırı güvenlidir; doğrulama döneminde uydurulan bir yeniden kalibrasyon Brier skorunu iyileştirmemiştir (0,0271). Doğrulama döneminde seçilen Mod B iptal modeli sınıf ağırlıklandırma kullandığından ham skorları olasılık değildir (Brier skoru 0,161) ve yalnızca sıralama kalitesi ile eşikleri kullanılır; doğrulama döneminde uydurulan izotonik kalibrasyon Brier skorunu 0,0260'a indirmektedir. Dolayısıyla prototipin gösterdiği olasılıklar (Mod A) yaklaşık kalibre riskler olarak okunabilir.</w:t>
       </w:r>
     </w:p>
     <w:p>
@@ -18603,7 +18620,7 @@
                 <w:szCs w:val="12"/>
                 <w:lang w:val="en-US"/>
               </w:rPr>
-              <w:t xml:space="preserve">0,981</w:t>
+              <w:t xml:space="preserve">0,980</w:t>
             </w:r>
           </w:p>
         </w:tc>
@@ -18630,7 +18647,7 @@
                 <w:szCs w:val="12"/>
                 <w:lang w:val="en-US"/>
               </w:rPr>
-              <w:t xml:space="preserve">0,959</w:t>
+              <w:t xml:space="preserve">0,967</w:t>
             </w:r>
           </w:p>
         </w:tc>
@@ -18657,7 +18674,7 @@
                 <w:szCs w:val="12"/>
                 <w:lang w:val="en-US"/>
               </w:rPr>
-              <w:t xml:space="preserve">0,970</w:t>
+              <w:t xml:space="preserve">0,973</w:t>
             </w:r>
           </w:p>
         </w:tc>
@@ -18840,7 +18857,7 @@
                 <w:szCs w:val="12"/>
                 <w:lang w:val="en-US"/>
               </w:rPr>
-              <w:t xml:space="preserve">0,209</w:t>
+              <w:t xml:space="preserve">0,222</w:t>
             </w:r>
           </w:p>
         </w:tc>
@@ -18867,7 +18884,7 @@
                 <w:szCs w:val="12"/>
                 <w:lang w:val="en-US"/>
               </w:rPr>
-              <w:t xml:space="preserve">0,368</w:t>
+              <w:t xml:space="preserve">0,319</w:t>
             </w:r>
           </w:p>
         </w:tc>
@@ -18894,7 +18911,7 @@
                 <w:szCs w:val="12"/>
                 <w:lang w:val="en-US"/>
               </w:rPr>
-              <w:t xml:space="preserve">0,266</w:t>
+              <w:t xml:space="preserve">0,262</w:t>
             </w:r>
           </w:p>
         </w:tc>
@@ -19086,7 +19103,7 @@
                 <w:szCs w:val="12"/>
                 <w:lang w:val="en-US"/>
               </w:rPr>
-              <w:t xml:space="preserve">0,632</w:t>
+              <w:t xml:space="preserve">0,650</w:t>
             </w:r>
           </w:p>
         </w:tc>
@@ -19113,7 +19130,7 @@
                 <w:szCs w:val="12"/>
                 <w:lang w:val="en-US"/>
               </w:rPr>
-              <w:t xml:space="preserve">0,850</w:t>
+              <w:t xml:space="preserve">0,849</w:t>
             </w:r>
           </w:p>
         </w:tc>
@@ -19140,7 +19157,7 @@
                 <w:szCs w:val="12"/>
                 <w:lang w:val="en-US"/>
               </w:rPr>
-              <w:t xml:space="preserve">0,725</w:t>
+              <w:t xml:space="preserve">0,736</w:t>
             </w:r>
           </w:p>
         </w:tc>
@@ -19323,7 +19340,7 @@
                 <w:szCs w:val="12"/>
                 <w:lang w:val="en-US"/>
               </w:rPr>
-              <w:t xml:space="preserve">0,842</w:t>
+              <w:t xml:space="preserve">0,844</w:t>
             </w:r>
           </w:p>
         </w:tc>
@@ -19350,7 +19367,7 @@
                 <w:szCs w:val="12"/>
                 <w:lang w:val="en-US"/>
               </w:rPr>
-              <w:t xml:space="preserve">0,739</w:t>
+              <w:t xml:space="preserve">0,758</w:t>
             </w:r>
           </w:p>
         </w:tc>
@@ -19377,7 +19394,7 @@
                 <w:szCs w:val="12"/>
                 <w:lang w:val="en-US"/>
               </w:rPr>
-              <w:t xml:space="preserve">0,788</w:t>
+              <w:t xml:space="preserve">0,799</w:t>
             </w:r>
           </w:p>
         </w:tc>
@@ -19560,7 +19577,7 @@
                 <w:szCs w:val="12"/>
                 <w:lang w:val="en-US"/>
               </w:rPr>
-              <w:t xml:space="preserve">0,408</w:t>
+              <w:t xml:space="preserve">0,370</w:t>
             </w:r>
           </w:p>
         </w:tc>
@@ -19587,7 +19604,7 @@
                 <w:szCs w:val="12"/>
                 <w:lang w:val="en-US"/>
               </w:rPr>
-              <w:t xml:space="preserve">0,128</w:t>
+              <w:t xml:space="preserve">0,122</w:t>
             </w:r>
           </w:p>
         </w:tc>
@@ -19614,7 +19631,7 @@
                 <w:szCs w:val="12"/>
                 <w:lang w:val="en-US"/>
               </w:rPr>
-              <w:t xml:space="preserve">0,194</w:t>
+              <w:t xml:space="preserve">0,183</w:t>
             </w:r>
           </w:p>
         </w:tc>
@@ -19833,7 +19850,7 @@
                 <w:szCs w:val="12"/>
                 <w:lang w:val="en-US"/>
               </w:rPr>
-              <w:t xml:space="preserve">0,952</w:t>
+              <w:t xml:space="preserve">0,951</w:t>
             </w:r>
           </w:p>
         </w:tc>
@@ -20043,7 +20060,7 @@
                 <w:szCs w:val="12"/>
                 <w:lang w:val="en-US"/>
               </w:rPr>
-              <w:t xml:space="preserve">0,349</w:t>
+              <w:t xml:space="preserve">0,348</w:t>
             </w:r>
           </w:p>
         </w:tc>
@@ -20070,7 +20087,7 @@
                 <w:szCs w:val="12"/>
                 <w:lang w:val="en-US"/>
               </w:rPr>
-              <w:t xml:space="preserve">0,067</w:t>
+              <w:t xml:space="preserve">0,068</w:t>
             </w:r>
           </w:p>
         </w:tc>
@@ -20280,7 +20297,7 @@
                 <w:szCs w:val="12"/>
                 <w:lang w:val="en-US"/>
               </w:rPr>
-              <w:t xml:space="preserve">0,139</w:t>
+              <w:t xml:space="preserve">0,204</w:t>
             </w:r>
           </w:p>
         </w:tc>
@@ -20334,7 +20351,7 @@
                 <w:szCs w:val="12"/>
                 <w:lang w:val="en-US"/>
               </w:rPr>
-              <w:t xml:space="preserve">0,000</w:t>
+              <w:t xml:space="preserve">0,001</w:t>
             </w:r>
           </w:p>
         </w:tc>
@@ -20517,7 +20534,7 @@
                 <w:szCs w:val="12"/>
                 <w:lang w:val="en-US"/>
               </w:rPr>
-              <w:t xml:space="preserve">0,439</w:t>
+              <w:t xml:space="preserve">0,437</w:t>
             </w:r>
           </w:p>
         </w:tc>
@@ -20544,7 +20561,7 @@
                 <w:szCs w:val="12"/>
                 <w:lang w:val="en-US"/>
               </w:rPr>
-              <w:t xml:space="preserve">0,243</w:t>
+              <w:t xml:space="preserve">0,246</w:t>
             </w:r>
           </w:p>
         </w:tc>
@@ -20571,7 +20588,7 @@
                 <w:szCs w:val="12"/>
                 <w:lang w:val="en-US"/>
               </w:rPr>
-              <w:t xml:space="preserve">0,313</w:t>
+              <w:t xml:space="preserve">0,315</w:t>
             </w:r>
           </w:p>
         </w:tc>
@@ -20763,7 +20780,7 @@
                 <w:szCs w:val="12"/>
                 <w:lang w:val="en-US"/>
               </w:rPr>
-              <w:t xml:space="preserve">0,778</w:t>
+              <w:t xml:space="preserve">0,780</w:t>
             </w:r>
           </w:p>
         </w:tc>
@@ -20790,7 +20807,7 @@
                 <w:szCs w:val="12"/>
                 <w:lang w:val="en-US"/>
               </w:rPr>
-              <w:t xml:space="preserve">0,460</w:t>
+              <w:t xml:space="preserve">0,455</w:t>
             </w:r>
           </w:p>
         </w:tc>
@@ -20817,7 +20834,7 @@
                 <w:szCs w:val="12"/>
                 <w:lang w:val="en-US"/>
               </w:rPr>
-              <w:t xml:space="preserve">0,578</w:t>
+              <w:t xml:space="preserve">0,575</w:t>
             </w:r>
           </w:p>
         </w:tc>
@@ -21000,7 +21017,7 @@
                 <w:szCs w:val="12"/>
                 <w:lang w:val="en-US"/>
               </w:rPr>
-              <w:t xml:space="preserve">0,242</w:t>
+              <w:t xml:space="preserve">0,241</w:t>
             </w:r>
           </w:p>
         </w:tc>
@@ -21027,7 +21044,7 @@
                 <w:szCs w:val="12"/>
                 <w:lang w:val="en-US"/>
               </w:rPr>
-              <w:t xml:space="preserve">0,323</w:t>
+              <w:t xml:space="preserve">0,327</w:t>
             </w:r>
           </w:p>
         </w:tc>
@@ -21054,7 +21071,7 @@
                 <w:szCs w:val="12"/>
                 <w:lang w:val="en-US"/>
               </w:rPr>
-              <w:t xml:space="preserve">0,277</w:t>
+              <w:t xml:space="preserve">0,278</w:t>
             </w:r>
           </w:p>
         </w:tc>
@@ -21237,7 +21254,7 @@
                 <w:szCs w:val="12"/>
                 <w:lang w:val="en-US"/>
               </w:rPr>
-              <w:t xml:space="preserve">0,114</w:t>
+              <w:t xml:space="preserve">0,115</w:t>
             </w:r>
           </w:p>
         </w:tc>
@@ -21264,7 +21281,7 @@
                 <w:szCs w:val="12"/>
                 <w:lang w:val="en-US"/>
               </w:rPr>
-              <w:t xml:space="preserve">0,248</w:t>
+              <w:t xml:space="preserve">0,251</w:t>
             </w:r>
           </w:p>
         </w:tc>
@@ -21291,7 +21308,7 @@
                 <w:szCs w:val="12"/>
                 <w:lang w:val="en-US"/>
               </w:rPr>
-              <w:t xml:space="preserve">0,156</w:t>
+              <w:t xml:space="preserve">0,158</w:t>
             </w:r>
           </w:p>
         </w:tc>
@@ -21488,7 +21505,7 @@
                 <w:szCs w:val="12"/>
                 <w:lang w:val="en-US"/>
               </w:rPr>
-              <w:t xml:space="preserve">0,280</w:t>
+              <w:t xml:space="preserve">0,279</w:t>
             </w:r>
           </w:p>
         </w:tc>
@@ -21517,7 +21534,7 @@
                 <w:szCs w:val="12"/>
                 <w:lang w:val="en-US"/>
               </w:rPr>
-              <w:t xml:space="preserve">0,469</w:t>
+              <w:t xml:space="preserve">0,467</w:t>
             </w:r>
           </w:p>
         </w:tc>
@@ -21546,7 +21563,7 @@
                 <w:szCs w:val="12"/>
                 <w:lang w:val="en-US"/>
               </w:rPr>
-              <w:t xml:space="preserve">0,351</w:t>
+              <w:t xml:space="preserve">0,350</w:t>
             </w:r>
           </w:p>
         </w:tc>
@@ -21870,7 +21887,7 @@
         <w:rPr>
           <w:w w:val="110"/>
         </w:rPr>
-        <w:t xml:space="preserve">İptal nedeni modeli, iptal edilen uçuşları DOT sınıflarından havayolu (A), hava durumu (B) veya ulusal hava sistemi (C) sınıfına atamaktadır; güvenlik sınıfı (D) ve 'diğer' sınıfı N kullanılmamıştır (Veri ön işleme bölümüne bakınız). Test döneminde doğruluk Mod A'da %70,7 (%70,1-%71,2), Mod B'de %73,9 (%73,4-%74,3) olup her zaman en sık sınıfı (hava durumu) tahmin etmenin %60,2'lik tabanıyla karşılaştırılmaktadır. Makro ortalamalı F1 sırasıyla 0,541 ve 0,569'dur (Bölüm 4.5.1).</w:t>
+        <w:t xml:space="preserve">İptal nedeni modeli, iptal edilen uçuşları DOT sınıflarından havayolu (A), hava durumu (B) veya ulusal hava sistemi (C) sınıfına atamaktadır; güvenlik sınıfı (D) ve 'diğer' sınıfı N kullanılmamıştır (Veri ön işleme bölümüne bakınız). Test döneminde doğruluk Mod A'da %70,7 (%70,1-%71,2), Mod B'de %75,0 (%74,5-%75,5) olup her zaman en sık sınıfı (hava durumu) tahmin etmenin %60,2'lik tabanıyla karşılaştırılmaktadır. Makro ortalamalı F1 sırasıyla 0,541 ve 0,573'tür (Bölüm 4.5.1).</w:t>
       </w:r>
     </w:p>
     <w:p>
@@ -21898,7 +21915,7 @@
         <w:rPr>
           <w:w w:val="110"/>
         </w:rPr>
-        <w:t xml:space="preserve">Sınıf bazında (Mod B; Tablo 7), havayolu kaynaklı iptaller %63,2 kesinlik, %85,0 duyarlılık ve 0,725 F1 ile, hava durumu kaynaklı iptaller ise %84,2 kesinlik, %73,9 duyarlılık ve 0,788 F1 ile tanınmaktadır. Mod A bu iki sınıf için 0,693 ve 0,755 F1 vermektedir.</w:t>
+        <w:t xml:space="preserve">Sınıf bazında (Mod B; Tablo 7), havayolu kaynaklı iptaller %65,0 kesinlik, %84,9 duyarlılık ve 0,736 F1 ile, hava durumu kaynaklı iptaller ise %84,4 kesinlik, %75,8 duyarlılık ve 0,799 F1 ile tanınmaktadır. Mod A bu iki sınıf için 0,693 ve 0,755 F1 vermektedir.</w:t>
       </w:r>
     </w:p>
     <w:p>
@@ -21915,7 +21932,7 @@
         <w:rPr>
           <w:w w:val="110"/>
         </w:rPr>
-        <w:t xml:space="preserve">Ulusal hava sistemi sınıfı (C) nadiren tanınmaktadır: Mod B'de kesinlik %40,8, duyarlılık %12,8 ve F1 0,194 (Mod A: duyarlılık %11,4). Bu sınıf nadirdir (test iptallerinin %6,1'i, eğitim iptallerinin %11,7'si) ve nedenleri (hava trafik yönetimi önlemleri) tarife, geçmiş ve günlük hava durumundan çıkarsanması güç şeylerdir.</w:t>
+        <w:t xml:space="preserve">Ulusal hava sistemi sınıfı (C) nadiren tanınmaktadır: Mod B'de kesinlik %37,0, duyarlılık %12,2 ve F1 0,183 (Mod A: duyarlılık %11,4). Bu sınıf nadirdir (test iptallerinin %6,1'i, eğitim iptallerinin %11,7'si) ve nedenleri (hava trafik yönetimi önlemleri) tarife, geçmiş ve günlük hava durumundan çıkarsanması güç şeylerdir.</w:t>
       </w:r>
     </w:p>
     <w:p>
@@ -21932,7 +21949,7 @@
         <w:rPr>
           <w:w w:val="110"/>
         </w:rPr>
-        <w:t xml:space="preserve">Çoğunluk sınıfı tabanına göre doğruluk kazancı Mod A'da 10,5 yüzde puan, Mod B'de 13,7 puandır. Nedenlerin dağılımı zamanla değişmektedir (hava durumu kaynaklı iptallerin payı eğitim döneminde %52,2, test döneminde %60,2; havayolu kaynaklı iptallerde %36,1 ve %33,7); bu durum neden modelinin aktarılabilirliğini sınırlamaktadır.</w:t>
+        <w:t xml:space="preserve">Çoğunluk sınıfı tabanına göre doğruluk kazancı Mod A'da 10,5 yüzde puan, Mod B'de 14,8 puandır. Nedenlerin dağılımı zamanla değişmektedir (hava durumu kaynaklı iptallerin payı eğitim döneminde %52,2, test döneminde %60,2; havayolu kaynaklı iptallerde %36,1 ve %33,7); bu durum neden modelinin aktarılabilirliğini sınırlamaktadır.</w:t>
       </w:r>
     </w:p>
     <w:p>
@@ -21990,7 +22007,7 @@
         <w:rPr>
           <w:w w:val="110"/>
         </w:rPr>
-        <w:t xml:space="preserve">Kalkış gecikmesi tahmini dört sınıf için bildirilmiştir (&lt;=0, 1-15, 16-30 ve &gt;30 dakika). Sınıf ağırlığı olmayan doğruluk odaklı model Mod A'da %60,8 (%60,7-%60,9), Mod B'de %61,9 (%61,8-%62,0) doğruluğa ulaşmış; her zaman en sık sınıfı ('&lt;=0 dk') tahmin etmek %60,0 vermektedir; makro-F1 yalnızca 0,269 ve 0,299'dur (Bölüm 4.5.1). Dolayısıyla dört sınıflı gecikme problemi, kalkıştan önce bilinen bilgilerle ancak sınırlı ölçüde tahmin edilebilir.</w:t>
+        <w:t xml:space="preserve">Kalkış gecikmesi tahmini dört sınıf için bildirilmiştir (&lt;=0, 1-15, 16-30 ve &gt;30 dakika). Sınıf ağırlığı olmayan doğruluk odaklı model Mod A'da %60,8 (%60,7-%60,9), Mod B'de %61,9 (%61,8-%62,0) doğruluğa ulaşmış; her zaman en sık sınıfı ('&lt;=0 dk') tahmin etmek %60,0 vermektedir; makro-F1 yalnızca 0,269 ve 0,300'dür (Bölüm 4.5.1). Dolayısıyla dört sınıflı gecikme problemi, kalkıştan önce bilinen bilgilerle ancak sınırlı ölçüde tahmin edilebilir.</w:t>
       </w:r>
     </w:p>
     <w:p>
@@ -22107,7 +22124,7 @@
         <w:rPr>
           <w:w w:val="110"/>
         </w:rPr>
-        <w:t xml:space="preserve">Sınıf bazında (ağırlıksız Mod B; Tablo 7), '&lt;=0 dk' sınıfında kesinlik %64,7 ve duyarlılık %95,2, '1-15 dk' sınıfında kesinlik %34,9 ve duyarlılık %6,7, '16-30 dk' sınıfında duyarlılık %0,0 ve '&gt;30 dk' sınıfında kesinlik %43,9 ve duyarlılık %24,3'tür.</w:t>
+        <w:t xml:space="preserve">Sınıf bazında (ağırlıksız Mod B; Tablo 7), '&lt;=0 dk' sınıfında kesinlik %64,7 ve duyarlılık %95,1, '1-15 dk' sınıfında kesinlik %34,8 ve duyarlılık %6,8, '16-30 dk' sınıfında duyarlılık %0,0 ve '&gt;30 dk' sınıfında kesinlik %43,7 ve duyarlılık %24,6'dır.</w:t>
       </w:r>
     </w:p>
     <w:p>
@@ -22124,7 +22141,7 @@
         <w:rPr>
           <w:w w:val="110"/>
         </w:rPr>
-        <w:t xml:space="preserve">Dengeli sınıf ağırlıklarıyla gecikmeli sınıfların duyarlılığı artmakta (Mod A'da makro-F1 0,318, Mod B'de 0,340; Mod B'de '&gt;30 dk' sınıfının duyarlılığı %46,9), ancak genel doğruluk %38,6 ve %42,1'e düşmektedir. Uzun gecikmelerin tespiti genel doğruluktan daha değerliyse ağırlıklı varyant tercih edilir.</w:t>
+        <w:t xml:space="preserve">Dengeli sınıf ağırlıklarıyla gecikmeli sınıfların duyarlılığı artmakta (Mod A'da makro-F1 0,318, Mod B'de 0,340; Mod B'de '&gt;30 dk' sınıfının duyarlılığı %46,7), ancak genel doğruluk %38,6 ve %41,9'a düşmektedir. Uzun gecikmelerin tespiti genel doğruluktan daha değerliyse ağırlıklı varyant tercih edilir.</w:t>
       </w:r>
     </w:p>
     <w:p>
@@ -22141,7 +22158,7 @@
         <w:rPr>
           <w:w w:val="110"/>
         </w:rPr>
-        <w:t xml:space="preserve">Gecikmiş uçuşun DOT tanımı (15 dakikadan fazla) için dört sınıf olasılığı ikili bir skora indirgenebilir; ROC-AUC değeri 0,693 (Mod A) ve 0,721 (Mod B), PR-AUC değeri 0,386 ve 0,446'dır (yaygınlık 0,222). Gecikme sonuçları bir dağılım kayması ışığında değerlendirilmelidir: geciken uçuşların payı eğitim döneminde %32'den test döneminde %40'a yükselmektedir. Ağırlıksız Mod B modelinin bire-karşı-diğerleri ROC eğrileri (Şekil 13), 0,64 (1-15 dk) ile 0,72 (&gt;30 dk) arasında değişen AUC değerleri vermektedir; iki uç sınıf en iyi ayrıştırılan sınıflardır.</w:t>
+        <w:t xml:space="preserve">Gecikmiş uçuşun DOT tanımı (15 dakikadan fazla) için dört sınıf olasılığı ikili bir skora indirgenebilir; ROC-AUC değeri 0,693 (Mod A) ve 0,721 (Mod B), PR-AUC değeri 0,386 ve 0,445'tir (yaygınlık 0,222). Gecikme sonuçları bir dağılım kayması ışığında değerlendirilmelidir: geciken uçuşların payı eğitim döneminde %32'den test döneminde %40'a yükselmektedir. Ağırlıksız Mod B modelinin bire-karşı-diğerleri ROC eğrileri (Şekil 13), 0,64 (1-15 dk) ile 0,72 (&gt;30 dk) arasında değişen AUC değerleri vermektedir; iki uç sınıf en iyi ayrıştırılan sınıflardır.</w:t>
       </w:r>
     </w:p>
     <w:p>
@@ -22361,7 +22378,7 @@
         <w:rPr>
           <w:w w:val="110"/>
         </w:rPr>
-        <w:t xml:space="preserve">İptal başarımı aylar arasında güçlü biçimde değişmektedir (Tablo 8, Şekil 14): aylık PR-AUC Mod A'da 0,013 ile 0,220, Mod B'de 0,026 ile 0,275 arasında, aylık ROC-AUC ise 0,62 ile 0,83 (Mod A) ve 0,70 ile 0,87 (Mod B) arasındadır. İptaller birkaç aksama gününde yoğunlaşmaktadır: en çok iptal yaşanan günlerin %5'i verideki tüm iptallerin %52'sini oluşturmaktadır (örneğin kış fırtınaları ve 2020 pandemi dönemi); bu tür olayların yaşandığı aylar daha iyi, tekil iptallerin görüldüğü aylar (örneğin Mayıs 2023, yaygınlık %0,55) ise neredeyse hiç tahmin edilememektedir.</w:t>
+        <w:t xml:space="preserve">İptal başarımı aylar arasında güçlü biçimde değişmektedir (Tablo 8, Şekil 14): aylık PR-AUC Mod A'da 0,013 ile 0,220, Mod B'de 0,020 ile 0,228 arasında, aylık ROC-AUC ise 0,62 ile 0,83 (Mod A) ve 0,66 ile 0,86 (Mod B) arasındadır. İptaller birkaç aksama gününde yoğunlaşmaktadır: en çok iptal yaşanan günlerin %5'i verideki tüm iptallerin %52'sini oluşturmaktadır (örneğin kış fırtınaları ve 2020 pandemi dönemi); bu tür olayların yaşandığı aylar daha iyi, tekil iptallerin görüldüğü aylar (örneğin Mayıs 2023, yaygınlık %0,55) ise neredeyse hiç tahmin edilememektedir.</w:t>
       </w:r>
     </w:p>
     <w:p>
@@ -22379,6 +22396,23 @@
           <w:w w:val="110"/>
         </w:rPr>
         <w:t xml:space="preserve">Ocak 2024, 582.425 uçuşluk eksiksiz bir ay olarak test uçuşlarının %56'sını oluşturmakta; bu nedenle birleştirilmiş test ölçütleri tek bir kış ayının egemenliğindedir. 2023 ayları DOT kayıtlarından alınan 3 milyon uçuşluk bir örneklemden gelmekte ve yaklaşık on kat daha seyrektir. Bu nedenle birleştirilmiş sonuçlar aylık değerlerle birlikte okunmalıdır.</w:t>
+      </w:r>
+    </w:p>
+    <w:p>
+      <w:pPr>
+        <w:pStyle w:val="GvdeMetni"/>
+        <w:spacing w:line="273" w:lineRule="auto"/>
+        <w:ind w:left="43" w:right="183" w:firstLine="239"/>
+        <w:jc w:val="both"/>
+        <w:rPr>
+          <w:w w:val="110"/>
+        </w:rPr>
+      </w:pPr>
+      <w:r>
+        <w:rPr>
+          <w:w w:val="110"/>
+        </w:rPr>
+        <w:t xml:space="preserve">Test döneminin iki bölümü ayrı ayrı değerlendirildiğinde şu sonuçlar elde edilir (Mod A / Mod B). 2023 ayları için (463.484 uçuş, yaygınlık %1,68) iptal PR-AUC değeri 0,095 / 0,142, ROC-AUC değeri 0,753 / 0,798; Ocak 2024 için (582.425 uçuş, yaygınlık %3,79) PR-AUC 0,128 / 0,195 ve ROC-AUC 0,797 / 0,852'dir. İptal nedeni doğruluğu 2023'te %64,3 / %65,3 (çoğunluk sınıfı tabanı %56,4), Ocak 2024'te %72,9 / %78,4'tür (taban %61,5). Ağırlıksız dört sınıflı gecikme modelinin doğruluğu 2023'te %61,0 / %61,6 (taban %59,6), Ocak 2024'te %60,6 / %62,1 (taban %60,3), 15 dakikadan uzun gecikmeler için ROC-AUC ise 0,708 / 0,723 ve 0,682 / 0,720'dir. Gün içi durum dolayısıyla iptallerin sıralanmasını her iki bölümde de iyileştirmekte (PR-AUC Mod A'nın yaklaşık 1,5 katı), iptal nedeni doğruluğundaki büyük kazanç ise Ocak 2024'te yoğunlaşmaktadır. 2023 ayları uçuşların yaklaşık onda birinden oluşan bir örneklem olduğundan ülke ve havayolu düzeyindeki gün içi istatistikler orada daha gürültülüdür; eksiksiz veriye dayanan Ocak 2024'te ölçülen yarar, canlı bir operasyonel veri akışı için muhtemelen daha temsil edicidir ve birleştirilmiş Mod B değerleri her iki rejimi karıştırmaktadır.</w:t>
       </w:r>
     </w:p>
     <w:p>
@@ -22830,7 +22864,7 @@
                 <w:szCs w:val="12"/>
                 <w:lang w:val="en-US"/>
               </w:rPr>
-              <w:t xml:space="preserve">0,147</w:t>
+              <w:t xml:space="preserve">0,132</w:t>
             </w:r>
           </w:p>
         </w:tc>
@@ -22884,7 +22918,7 @@
                 <w:szCs w:val="12"/>
                 <w:lang w:val="en-US"/>
               </w:rPr>
-              <w:t xml:space="preserve">0,826</w:t>
+              <w:t xml:space="preserve">0,816</w:t>
             </w:r>
           </w:p>
         </w:tc>
@@ -23023,7 +23057,7 @@
                 <w:szCs w:val="12"/>
                 <w:lang w:val="en-US"/>
               </w:rPr>
-              <w:t xml:space="preserve">0,275</w:t>
+              <w:t xml:space="preserve">0,228</w:t>
             </w:r>
           </w:p>
         </w:tc>
@@ -23077,7 +23111,7 @@
                 <w:szCs w:val="12"/>
                 <w:lang w:val="en-US"/>
               </w:rPr>
-              <w:t xml:space="preserve">0,874</w:t>
+              <w:t xml:space="preserve">0,860</w:t>
             </w:r>
           </w:p>
         </w:tc>
@@ -23216,7 +23250,7 @@
                 <w:szCs w:val="12"/>
                 <w:lang w:val="en-US"/>
               </w:rPr>
-              <w:t xml:space="preserve">0,081</w:t>
+              <w:t xml:space="preserve">0,070</w:t>
             </w:r>
           </w:p>
         </w:tc>
@@ -23270,7 +23304,7 @@
                 <w:szCs w:val="12"/>
                 <w:lang w:val="en-US"/>
               </w:rPr>
-              <w:t xml:space="preserve">0,740</w:t>
+              <w:t xml:space="preserve">0,721</w:t>
             </w:r>
           </w:p>
         </w:tc>
@@ -23409,7 +23443,7 @@
                 <w:szCs w:val="12"/>
                 <w:lang w:val="en-US"/>
               </w:rPr>
-              <w:t xml:space="preserve">0,118</w:t>
+              <w:t xml:space="preserve">0,107</w:t>
             </w:r>
           </w:p>
         </w:tc>
@@ -23463,7 +23497,7 @@
                 <w:szCs w:val="12"/>
                 <w:lang w:val="en-US"/>
               </w:rPr>
-              <w:t xml:space="preserve">0,762</w:t>
+              <w:t xml:space="preserve">0,757</w:t>
             </w:r>
           </w:p>
         </w:tc>
@@ -23602,7 +23636,7 @@
                 <w:szCs w:val="12"/>
                 <w:lang w:val="en-US"/>
               </w:rPr>
-              <w:t xml:space="preserve">0,026</w:t>
+              <w:t xml:space="preserve">0,020</w:t>
             </w:r>
           </w:p>
         </w:tc>
@@ -23656,7 +23690,7 @@
                 <w:szCs w:val="12"/>
                 <w:lang w:val="en-US"/>
               </w:rPr>
-              <w:t xml:space="preserve">0,702</w:t>
+              <w:t xml:space="preserve">0,664</w:t>
             </w:r>
           </w:p>
         </w:tc>
@@ -23795,7 +23829,7 @@
                 <w:szCs w:val="12"/>
                 <w:lang w:val="en-US"/>
               </w:rPr>
-              <w:t xml:space="preserve">0,216</w:t>
+              <w:t xml:space="preserve">0,213</w:t>
             </w:r>
           </w:p>
         </w:tc>
@@ -23849,7 +23883,7 @@
                 <w:szCs w:val="12"/>
                 <w:lang w:val="en-US"/>
               </w:rPr>
-              <w:t xml:space="preserve">0,847</w:t>
+              <w:t xml:space="preserve">0,837</w:t>
             </w:r>
           </w:p>
         </w:tc>
@@ -23988,7 +24022,7 @@
                 <w:szCs w:val="12"/>
                 <w:lang w:val="en-US"/>
               </w:rPr>
-              <w:t xml:space="preserve">0,191</w:t>
+              <w:t xml:space="preserve">0,157</w:t>
             </w:r>
           </w:p>
         </w:tc>
@@ -24042,7 +24076,7 @@
                 <w:szCs w:val="12"/>
                 <w:lang w:val="en-US"/>
               </w:rPr>
-              <w:t xml:space="preserve">0,803</w:t>
+              <w:t xml:space="preserve">0,785</w:t>
             </w:r>
           </w:p>
         </w:tc>
@@ -24181,7 +24215,7 @@
                 <w:szCs w:val="12"/>
                 <w:lang w:val="en-US"/>
               </w:rPr>
-              <w:t xml:space="preserve">0,095</w:t>
+              <w:t xml:space="preserve">0,085</w:t>
             </w:r>
           </w:p>
         </w:tc>
@@ -24235,7 +24269,7 @@
                 <w:szCs w:val="12"/>
                 <w:lang w:val="en-US"/>
               </w:rPr>
-              <w:t xml:space="preserve">0,764</w:t>
+              <w:t xml:space="preserve">0,745</w:t>
             </w:r>
           </w:p>
         </w:tc>
@@ -24384,7 +24418,7 @@
                 <w:szCs w:val="12"/>
                 <w:lang w:val="en-US"/>
               </w:rPr>
-              <w:t xml:space="preserve">0,211</w:t>
+              <w:t xml:space="preserve">0,195</w:t>
             </w:r>
           </w:p>
         </w:tc>
@@ -24442,7 +24476,7 @@
                 <w:szCs w:val="12"/>
                 <w:lang w:val="en-US"/>
               </w:rPr>
-              <w:t xml:space="preserve">0,858</w:t>
+              <w:t xml:space="preserve">0,852</w:t>
             </w:r>
           </w:p>
         </w:tc>
@@ -24587,7 +24621,7 @@
         <w:rPr>
           <w:w w:val="110"/>
         </w:rPr>
-        <w:t xml:space="preserve">Modeller doğrulama döneminde ayarlandığından test döneminde büyük bir düşüş, doğrulama verisine aşırı uyuma veya bir dağılım kaymasına işaret ederdi. İptal PR-AUC değeri Mod A'da 0,228'den (doğrulama) 0,119'a (test), Mod B'de 0,295'ten 0,196'ya düşmektedir. Neden modelinin doğruluğu %68,7'den %70,7'ye (Mod A) ve %69,4'ten %73,9'a (Mod B), ağırlıksız gecikme modelinin doğruluğu %62,9'dan %60,8'e ve %63,4'ten %61,9'a değişmektedir.</w:t>
+        <w:t xml:space="preserve">Modeller doğrulama döneminde ayarlandığından test döneminde büyük bir düşüş, doğrulama verisine aşırı uyuma veya bir dağılım kaymasına işaret ederdi. İptal PR-AUC değeri Mod A'da 0,228'den (doğrulama) 0,119'a (test), Mod B'de 0,292'ten 0,180'e düşmektedir. Neden modelinin doğruluğu %68,7'den %70,7'ye (Mod A) ve %70,3'ten %75,0'a (Mod B), ağırlıksız gecikme modelinin doğruluğu %62,9'dan %60,8'e ve %63,4'ten %61,9'a değişmektedir.</w:t>
       </w:r>
     </w:p>
     <w:p>
@@ -24676,7 +24710,7 @@
         <w:rPr>
           <w:w w:val="110"/>
         </w:rPr>
-        <w:t xml:space="preserve">Düzenlileştirme parametreleri (gamma, asgari çocuk ağırlığı, lambda, alpha, azami derinlik ve alt örnekleme oranları) bu aramanın parçasıdır ve elle ayarlanmamıştır. Seçilen değerler Tablo 9'da listelenmiştir. On iki iptal yapılandırması boyunca doğrulama PR-AUC değeri 0,254 ile 0,299 (Mod B), yirmi neden yapılandırması boyunca doğrulama makro-F1 değeri 0,568 ile 0,645 arasında değiştiğinden sonuçlar hiperparametrelere orta düzeyde duyarlıdır. Arama bilinçli olarak sınırlı tutulmuş, tek bir rastgele tohum kullanılmış ve iç içe doğrulama yapılmamıştır. Seçilen yapılandırma daha sonra tüm eğitim uçuşları üzerinde, hiperparametreleri dört ondalık basamakla saklanarak ve erken durdurma sabrı 40 yerine 50 tur olarak yeniden uydurulmuştur; bu nedenle nihai Mod B iptal modelinin doğrulama PR-AUC değeri (0,295, Bölüm 4.4.2) en iyi arama çalışmasının değerinden (0,299) ve ağaç sayısı 310'dan 237'ye hafifçe farklıdır. Bildirilen tüm sonuçlar yeniden uydurulmuş nihai modellere aittir.</w:t>
+        <w:t xml:space="preserve">Düzenlileştirme parametreleri (gamma, asgari çocuk ağırlığı, lambda, alpha, azami derinlik ve alt örnekleme oranları) bu aramanın parçasıdır ve elle ayarlanmamıştır. Seçilen değerler Tablo 9'da listelenmiştir. On iki iptal yapılandırması boyunca doğrulama PR-AUC değeri 0,247 ile 0,293 (Mod B), yirmi neden yapılandırması boyunca doğrulama makro-F1 değeri 0,572 ile 0,649 arasında değiştiğinden sonuçlar hiperparametrelere orta düzeyde duyarlıdır. Arama bilinçli olarak sınırlı tutulmuş, tek bir rastgele tohum kullanılmış ve iç içe doğrulama yapılmamıştır. Seçilen yapılandırma daha sonra tüm eğitim uçuşları üzerinde, hiperparametreleri dört ondalık basamakla saklanarak ve erken durdurma sabrı 40 yerine 50 tur olarak yeniden uydurulmuştur; bu nedenle nihai Mod B iptal modelinin doğrulama PR-AUC değeri (0,292, Bölüm 4.4.2) en iyi arama çalışmasının değerinden (0,293) ve ağaç sayısı 77'den 78'e hafifçe farklıdır. Sınıf ağırlığı şeması aramanın parçasıdır: Mod B iptal modeli için seçilen yapılandırma scale_pos_weight = n_neg/n_pos (yaklaşık 33) kullanmaktadır; bu nedenle ham skorları kalibre olasılık değildir (Bölüm 4.1). Karşılaştırma için, Mod A iptal modeli için seçilen yapılandırma Mod B girdileriyle uydurulduğunda doğrulama PR-AUC değeri 0,297, test PR-AUC değeri 0,195 olmaktadır (seçim için kullanılmayan sonradan yapılmış bir denetim; Mod B modeli: 0,292 ve 0,180); dolayısıyla doğrulama dönemi bu tür neredeyse eşdeğer yapılandırmaları ayırt edememektedir. Bildirilen tüm sonuçlar yeniden uydurulmuş nihai modellere aittir.</w:t>
       </w:r>
     </w:p>
     <w:p>
@@ -25129,7 +25163,7 @@
                 <w:szCs w:val="10"/>
                 <w:lang w:val="en-US"/>
               </w:rPr>
-              <w:t xml:space="preserve">0,041</w:t>
+              <w:t xml:space="preserve">0,059</w:t>
             </w:r>
           </w:p>
         </w:tc>
@@ -25155,7 +25189,7 @@
                 <w:szCs w:val="10"/>
                 <w:lang w:val="en-US"/>
               </w:rPr>
-              <w:t>4</w:t>
+              <w:t xml:space="preserve">4</w:t>
             </w:r>
           </w:p>
         </w:tc>
@@ -25181,7 +25215,7 @@
                 <w:szCs w:val="10"/>
                 <w:lang w:val="en-US"/>
               </w:rPr>
-              <w:t>2</w:t>
+              <w:t xml:space="preserve">7</w:t>
             </w:r>
           </w:p>
         </w:tc>
@@ -25207,7 +25241,7 @@
                 <w:szCs w:val="10"/>
                 <w:lang w:val="en-US"/>
               </w:rPr>
-              <w:t xml:space="preserve">0,80</w:t>
+              <w:t xml:space="preserve">0,87</w:t>
             </w:r>
           </w:p>
         </w:tc>
@@ -25233,7 +25267,7 @@
                 <w:szCs w:val="10"/>
                 <w:lang w:val="en-US"/>
               </w:rPr>
-              <w:t xml:space="preserve">0,69</w:t>
+              <w:t xml:space="preserve">0,90</w:t>
             </w:r>
           </w:p>
         </w:tc>
@@ -25259,7 +25293,7 @@
                 <w:szCs w:val="10"/>
                 <w:lang w:val="en-US"/>
               </w:rPr>
-              <w:t xml:space="preserve">2,91</w:t>
+              <w:t xml:space="preserve">2,04</w:t>
             </w:r>
           </w:p>
         </w:tc>
@@ -25285,7 +25319,7 @@
                 <w:szCs w:val="10"/>
                 <w:lang w:val="en-US"/>
               </w:rPr>
-              <w:t xml:space="preserve">0,5</w:t>
+              <w:t xml:space="preserve">1</w:t>
             </w:r>
           </w:p>
         </w:tc>
@@ -25311,7 +25345,7 @@
                 <w:szCs w:val="10"/>
                 <w:lang w:val="en-US"/>
               </w:rPr>
-              <w:t xml:space="preserve">0,5</w:t>
+              <w:t xml:space="preserve">3</w:t>
             </w:r>
           </w:p>
         </w:tc>
@@ -25336,7 +25370,7 @@
                 <w:szCs w:val="10"/>
                 <w:lang w:val="en-US"/>
               </w:rPr>
-              <w:t xml:space="preserve">yok</w:t>
+              <w:t xml:space="preserve">n_neg/n_pos</w:t>
             </w:r>
           </w:p>
         </w:tc>
@@ -25362,7 +25396,7 @@
                 <w:szCs w:val="10"/>
                 <w:lang w:val="en-US"/>
               </w:rPr>
-              <w:t>237</w:t>
+              <w:t xml:space="preserve">78</w:t>
             </w:r>
           </w:p>
         </w:tc>
@@ -25444,7 +25478,7 @@
                 <w:szCs w:val="10"/>
                 <w:lang w:val="en-US"/>
               </w:rPr>
-              <w:t>5</w:t>
+              <w:t xml:space="preserve">5</w:t>
             </w:r>
           </w:p>
         </w:tc>
@@ -25470,7 +25504,7 @@
                 <w:szCs w:val="10"/>
                 <w:lang w:val="en-US"/>
               </w:rPr>
-              <w:t>6</w:t>
+              <w:t xml:space="preserve">6</w:t>
             </w:r>
           </w:p>
         </w:tc>
@@ -25574,7 +25608,7 @@
                 <w:szCs w:val="10"/>
                 <w:lang w:val="en-US"/>
               </w:rPr>
-              <w:t>3</w:t>
+              <w:t xml:space="preserve">3</w:t>
             </w:r>
           </w:p>
         </w:tc>
@@ -25600,7 +25634,7 @@
                 <w:szCs w:val="10"/>
                 <w:lang w:val="en-US"/>
               </w:rPr>
-              <w:t>1</w:t>
+              <w:t xml:space="preserve">1</w:t>
             </w:r>
           </w:p>
         </w:tc>
@@ -25651,7 +25685,7 @@
                 <w:szCs w:val="10"/>
                 <w:lang w:val="en-US"/>
               </w:rPr>
-              <w:t>115</w:t>
+              <w:t xml:space="preserve">145</w:t>
             </w:r>
           </w:p>
         </w:tc>
@@ -25733,7 +25767,7 @@
                 <w:szCs w:val="10"/>
                 <w:lang w:val="en-US"/>
               </w:rPr>
-              <w:t>5</w:t>
+              <w:t xml:space="preserve">5</w:t>
             </w:r>
           </w:p>
         </w:tc>
@@ -25759,7 +25793,7 @@
                 <w:szCs w:val="10"/>
                 <w:lang w:val="en-US"/>
               </w:rPr>
-              <w:t>30</w:t>
+              <w:t xml:space="preserve">30</w:t>
             </w:r>
           </w:p>
         </w:tc>
@@ -25863,7 +25897,7 @@
                 <w:szCs w:val="10"/>
                 <w:lang w:val="en-US"/>
               </w:rPr>
-              <w:t>3</w:t>
+              <w:t xml:space="preserve">3</w:t>
             </w:r>
           </w:p>
         </w:tc>
@@ -25889,7 +25923,7 @@
                 <w:szCs w:val="10"/>
                 <w:lang w:val="en-US"/>
               </w:rPr>
-              <w:t>3</w:t>
+              <w:t xml:space="preserve">3</w:t>
             </w:r>
           </w:p>
         </w:tc>
@@ -25940,7 +25974,7 @@
                 <w:szCs w:val="10"/>
                 <w:lang w:val="en-US"/>
               </w:rPr>
-              <w:t>797</w:t>
+              <w:t xml:space="preserve">786</w:t>
             </w:r>
           </w:p>
         </w:tc>
@@ -26031,7 +26065,7 @@
                 <w:szCs w:val="10"/>
                 <w:lang w:val="en-US"/>
               </w:rPr>
-              <w:t>7</w:t>
+              <w:t xml:space="preserve">7</w:t>
             </w:r>
           </w:p>
         </w:tc>
@@ -26060,7 +26094,7 @@
                 <w:szCs w:val="10"/>
                 <w:lang w:val="en-US"/>
               </w:rPr>
-              <w:t>2</w:t>
+              <w:t xml:space="preserve">2</w:t>
             </w:r>
           </w:p>
         </w:tc>
@@ -26205,7 +26239,7 @@
                 <w:szCs w:val="10"/>
                 <w:lang w:val="en-US"/>
               </w:rPr>
-              <w:t>0</w:t>
+              <w:t xml:space="preserve">0</w:t>
             </w:r>
           </w:p>
         </w:tc>
@@ -26262,7 +26296,7 @@
                 <w:szCs w:val="10"/>
                 <w:lang w:val="en-US"/>
               </w:rPr>
-              <w:t>799</w:t>
+              <w:t xml:space="preserve">799</w:t>
             </w:r>
           </w:p>
         </w:tc>
@@ -26345,7 +26379,7 @@
         <w:rPr>
           <w:w w:val="110"/>
         </w:rPr>
-        <w:t xml:space="preserve">Nadir sınıflar nihai modellerde de zor olmaya devam etmektedir: ulusal hava sistemi iptallerinin duyarlılığı %13'tür (Mod B) ve 16-30 dakikalık gecikme sınıfı ağırlıksız gecikme modeli tarafından tahmin edilmemektedir. Maliyete duyarlı öğrenme (Elkan, 2001) ve sınıf ağırlıklandırma, genel doğruluğu nadir sınıf duyarlılığı karşılığında takas eder; tercih uygulamaya bağlıdır ve burada yapılmamıştır.</w:t>
+        <w:t xml:space="preserve">Nadir sınıflar nihai modellerde de zor olmaya devam etmektedir: ulusal hava sistemi iptallerinin duyarlılığı %12'dir (Mod B) ve 16-30 dakikalık gecikme sınıfı ağırlıksız gecikme modeli tarafından tahmin edilmemektedir. Maliyete duyarlı öğrenme (Elkan, 2001) ve sınıf ağırlıklandırma, genel doğruluğu nadir sınıf duyarlılığı karşılığında takas eder; tercih uygulamaya bağlıdır ve burada yapılmamıştır.</w:t>
       </w:r>
     </w:p>
     <w:p>
@@ -27820,7 +27854,7 @@
         <w:rPr>
           <w:w w:val="110"/>
         </w:rPr>
-        <w:t xml:space="preserve">Ablasyon (Tablo 11, doğrulama dönemi): takvim, tarife ve bir önceki günün hava durumundan (A kümesi) başlayarak geçmiş özelliklerin eklenmesi iptal PR-AUC değerini 0,069'dan 0,212'ye çıkarmaktadır. Tatillerin ve varış hava durumunun eklenmesi (C kümesi: 0,207) daha fazla yardımcı olmamakta, hava durumu değişkenlerinin tümüyle çıkarılması da zarar vermemektedir (D kümesi: 0,220); geçmiş özelliklerin çıkarılması ise PR-AUC değerini 0,067'ye düşürmektedir. Mod B'nin gün içi durumu bu değeri 0,283'e çıkarmaktadır (G kümesi). Neden modeli için doğruluk %54,8'den (A kümesi) %61,7'ye (C kümesi) ve gün içi durumla %64,5'e çıkmakta, hava durumu değişkenleri burada birkaç puan katkı yapmaktadır (C ve D kümeleri: %61,7 ve %59,1). Ağırlıksız gecikme modeli için doğruluk tüm özellik kümelerinde neredeyse değişmemektedir (%61,5-%63,2). Dolayısıyla bir önceki gün gözlemlenen hava durumu, yakın dönem operasyonel geçmiş bilindiğinde iptal tahminine çok az katkı sağlamaktadır; bunun nedeni muhtemelen geçmişin hava rejimini zaten yansıtmasıdır.</w:t>
+        <w:t xml:space="preserve">Ablasyon (Tablo 11, doğrulama dönemi): takvim, tarife ve bir önceki günün hava durumundan (A kümesi) başlayarak geçmiş özelliklerin eklenmesi iptal PR-AUC değerini 0,069'dan 0,212'ye çıkarmaktadır. Tatillerin ve varış hava durumunun eklenmesi (C kümesi: 0,207) daha fazla yardımcı olmamakta, hava durumu değişkenlerinin tümüyle çıkarılması da zarar vermemektedir (D kümesi: 0,220); geçmiş özelliklerin çıkarılması ise PR-AUC değerini 0,067'ye düşürmektedir. Mod B'nin gün içi durumu bu değeri 0,290'a çıkarmaktadır (G kümesi). Neden modeli için doğruluk %54,8'den (A kümesi) %61,7'ye (C kümesi) ve gün içi durumla %64,2'ye çıkmakta, hava durumu değişkenleri burada birkaç puan katkı yapmaktadır (C ve D kümeleri: %61,7 ve %59,1). Ağırlıksız gecikme modeli için doğruluk tüm özellik kümelerinde neredeyse değişmemektedir (%61,5-%63,2). Dolayısıyla bir önceki gün gözlemlenen hava durumu, yakın dönem operasyonel geçmiş bilindiğinde iptal tahminine çok az katkı sağlamaktadır; bunun nedeni muhtemelen geçmişin hava rejimini zaten yansıtmasıdır.</w:t>
       </w:r>
     </w:p>
     <w:p>
@@ -28698,7 +28732,7 @@
                 <w:szCs w:val="12"/>
                 <w:lang w:val="en-US"/>
               </w:rPr>
-              <w:t xml:space="preserve">0,283</w:t>
+              <w:t xml:space="preserve">0,290</w:t>
             </w:r>
           </w:p>
         </w:tc>
@@ -28724,7 +28758,7 @@
                 <w:szCs w:val="12"/>
                 <w:lang w:val="en-US"/>
               </w:rPr>
-              <w:t xml:space="preserve">%64,5</w:t>
+              <w:t xml:space="preserve">%64,2</w:t>
             </w:r>
           </w:p>
         </w:tc>
@@ -28806,7 +28840,7 @@
                 <w:szCs w:val="12"/>
                 <w:lang w:val="en-US"/>
               </w:rPr>
-              <w:t xml:space="preserve">0,282</w:t>
+              <w:t xml:space="preserve">0,288</w:t>
             </w:r>
           </w:p>
         </w:tc>
@@ -28832,7 +28866,7 @@
                 <w:szCs w:val="12"/>
                 <w:lang w:val="en-US"/>
               </w:rPr>
-              <w:t xml:space="preserve">%62,7</w:t>
+              <w:t xml:space="preserve">%62,0</w:t>
             </w:r>
           </w:p>
         </w:tc>
@@ -28858,7 +28892,7 @@
                 <w:szCs w:val="12"/>
                 <w:lang w:val="en-US"/>
               </w:rPr>
-              <w:t xml:space="preserve">%63,1</w:t>
+              <w:t xml:space="preserve">%63,2</w:t>
             </w:r>
           </w:p>
         </w:tc>
@@ -28920,7 +28954,7 @@
                 <w:szCs w:val="12"/>
                 <w:lang w:val="en-US"/>
               </w:rPr>
-              <w:t xml:space="preserve">0,238</w:t>
+              <w:t xml:space="preserve">0,242</w:t>
             </w:r>
           </w:p>
         </w:tc>
@@ -28949,7 +28983,7 @@
                 <w:szCs w:val="12"/>
                 <w:lang w:val="en-US"/>
               </w:rPr>
-              <w:t xml:space="preserve">%57,4</w:t>
+              <w:t xml:space="preserve">%57,8</w:t>
             </w:r>
           </w:p>
         </w:tc>
@@ -28998,7 +29032,7 @@
         <w:rPr>
           <w:w w:val="110"/>
         </w:rPr>
-        <w:t xml:space="preserve">Açıklanabilirlik: SHAP katkıları (Lundberg &amp; Lee, 2017) 30.000 rastgele test uçuşu için hesaplanmıştır. Mod B iptal modelinde en önemli girdiler havayolunun aynı gün iptal oranı (L_AIR_CANCEL), önceki gün ve önceki hafta havayolu iptal oranları (H_AIR_D1_CANCEL, H_AIR_D7_CANCEL), varış havalimanı ve ülke genelindeki aynı gün iptal oranıdır (Şekil 6). Neden modeli esas olarak havayoluna (AIRLINE_CODE), havalimanlarına ve tarihin mevsimsel konumuna (Şekil 7), gecikme modeli ise havayoluna, tarifeli kalkış dakikasına ve havalimanlarına dayanmaktadır (Şekil 8). Meteorolojik girdiler iptal modelinin en önemli özellikleri arasında yer almamaktadır.</w:t>
+        <w:t xml:space="preserve">Açıklanabilirlik: SHAP katkıları (Lundberg &amp; Lee, 2017) 30.000 rastgele test uçuşu için hesaplanmıştır. Mod B iptal modelinde en önemli girdiler havayolunun aynı gün iptal oranı (L_AIR_CANCEL), havayolunun önceki gün iptal oranı (H_AIR_D1_CANCEL), ülke genelindeki aynı gün iptal oranı (L_NAT_CANCEL), havayolunun önceki hafta iptal oranı (H_AIR_D7_CANCEL) ve varış havalimanıdır (Şekil 6). Neden modeli esas olarak havayoluna (AIRLINE_CODE), havalimanlarına ve tarihin mevsimsel konumuna (Şekil 7), gecikme modeli ise havayoluna, tarifeli kalkış dakikasına ve havalimanlarına dayanmaktadır (Şekil 8). Meteorolojik girdiler iptal modelinin en önemli özellikleri arasında yer almamaktadır.</w:t>
       </w:r>
     </w:p>
     <w:p>
@@ -29032,7 +29066,7 @@
         <w:rPr>
           <w:w w:val="110"/>
         </w:rPr>
-        <w:t xml:space="preserve">Maliyete duyarlı uyarı: yanlış alarmın ve kaçırılan bir iptalin maliyetleri bilinmemekte ve kullanıcıya (yolcu, havayolu) bağlı olmaktadır; bu nedenle göreli maliyetleri analiz ediyoruz: yanlış alarmın maliyeti bir birim, kaçırılan iptalin maliyeti r birimdir. Her r için doğrulama döneminde toplam maliyeti en küçükleyen karar eşiği test dönemine uygulanır (Tablo 12, Şekil 15). Mod B'de uyarılar r = 2'de kazanç sağlamaz (hiç uyarı vermemeye göre -%2,9) ve r = 5, 10, 20 ve 50'de %7,9, %25,0, %43,8 ve %64,9 tasarruf sağlar; r = 10'da uyarı oranı %10,5, duyarlılık %56,2 ve kesinlik %15,3'tür. Bu değerler tümüyle varsayılan maliyet oranına ve test döneminin yaygınlığına bağlıdır; parasal tahmin değildirler. Birim maliyetler bilinmediğinden ve bir yıla ekstrapolasyon gerekçelendirilemeyeceğinden, varsayılan birim maliyetlerden türetilen bir eşik veya yıllık parasal fayda bildirilmemektedir. Karışıklık matrisleri Şekil 9'da verilmiştir.</w:t>
+        <w:t xml:space="preserve">Maliyete duyarlı uyarı: yanlış alarmın ve kaçırılan bir iptalin maliyetleri bilinmemekte ve kullanıcıya (yolcu, havayolu) bağlı olmaktadır; bu nedenle göreli maliyetleri analiz ediyoruz: yanlış alarmın maliyeti bir birim, kaçırılan iptalin maliyeti r birimdir. Her r için doğrulama döneminde toplam maliyeti en küçükleyen karar eşiği test dönemine uygulanır (Tablo 12, Şekil 15). Mod B'de uyarılar r = 2'de kazanç sağlamaz (hiç uyarı vermemeye göre -%3,1) ve r = 5, 10, 20 ve 50'de %8,8, %24,0, %42,7 ve %63,2 tasarruf sağlar; r = 10'da uyarı oranı %11,5, duyarlılık %58,5 ve kesinlik %14,5'tir. Tablo 12'deki eşikler sınıf ağırlıklı Mod B skorlarına aittir. Bu değerler tümüyle varsayılan maliyet oranına ve test döneminin yaygınlığına bağlıdır; parasal tahmin değildirler. Birim maliyetler bilinmediğinden ve bir yıla ekstrapolasyon gerekçelendirilemeyeceğinden, varsayılan birim maliyetlerden türetilen bir eşik veya yıllık parasal fayda bildirilmemektedir. Karışıklık matrisleri Şekil 9'da verilmiştir.</w:t>
       </w:r>
     </w:p>
     <w:p>
@@ -29328,7 +29362,7 @@
                 <w:szCs w:val="12"/>
                 <w:lang w:val="en-US"/>
               </w:rPr>
-              <w:t xml:space="preserve">0,298</w:t>
+              <w:t xml:space="preserve">0,901</w:t>
             </w:r>
           </w:p>
         </w:tc>
@@ -29354,7 +29388,7 @@
                 <w:szCs w:val="12"/>
                 <w:lang w:val="en-US"/>
               </w:rPr>
-              <w:t xml:space="preserve">%1,6</w:t>
+              <w:t xml:space="preserve">%1,5</w:t>
             </w:r>
           </w:p>
         </w:tc>
@@ -29380,7 +29414,7 @@
                 <w:szCs w:val="12"/>
                 <w:lang w:val="en-US"/>
               </w:rPr>
-              <w:t xml:space="preserve">%17,2</w:t>
+              <w:t xml:space="preserve">%15,6</w:t>
             </w:r>
           </w:p>
         </w:tc>
@@ -29406,7 +29440,7 @@
                 <w:szCs w:val="12"/>
                 <w:lang w:val="en-US"/>
               </w:rPr>
-              <w:t xml:space="preserve">%30,0</w:t>
+              <w:t xml:space="preserve">%29,4</w:t>
             </w:r>
           </w:p>
         </w:tc>
@@ -29432,7 +29466,7 @@
                 <w:szCs w:val="12"/>
                 <w:lang w:val="en-US"/>
               </w:rPr>
-              <w:t xml:space="preserve">-%2,9</w:t>
+              <w:t xml:space="preserve">-%3,1</w:t>
             </w:r>
           </w:p>
         </w:tc>
@@ -29489,7 +29523,7 @@
                 <w:szCs w:val="12"/>
                 <w:lang w:val="en-US"/>
               </w:rPr>
-              <w:t xml:space="preserve">0,143</w:t>
+              <w:t xml:space="preserve">0,843</w:t>
             </w:r>
           </w:p>
         </w:tc>
@@ -29515,7 +29549,7 @@
                 <w:szCs w:val="12"/>
                 <w:lang w:val="en-US"/>
               </w:rPr>
-              <w:t xml:space="preserve">%5,7</w:t>
+              <w:t xml:space="preserve">%4,8</w:t>
             </w:r>
           </w:p>
         </w:tc>
@@ -29541,7 +29575,7 @@
                 <w:szCs w:val="12"/>
                 <w:lang w:val="en-US"/>
               </w:rPr>
-              <w:t xml:space="preserve">%39,6</w:t>
+              <w:t xml:space="preserve">%35,4</w:t>
             </w:r>
           </w:p>
         </w:tc>
@@ -29567,7 +29601,7 @@
                 <w:szCs w:val="12"/>
                 <w:lang w:val="en-US"/>
               </w:rPr>
-              <w:t xml:space="preserve">%20,0</w:t>
+              <w:t xml:space="preserve">%21,0</w:t>
             </w:r>
           </w:p>
         </w:tc>
@@ -29593,7 +29627,7 @@
                 <w:szCs w:val="12"/>
                 <w:lang w:val="en-US"/>
               </w:rPr>
-              <w:t xml:space="preserve">+%7,9</w:t>
+              <w:t xml:space="preserve">+%8,8</w:t>
             </w:r>
           </w:p>
         </w:tc>
@@ -29650,7 +29684,7 @@
                 <w:szCs w:val="12"/>
                 <w:lang w:val="en-US"/>
               </w:rPr>
-              <w:t xml:space="preserve">0,084</w:t>
+              <w:t xml:space="preserve">0,726</w:t>
             </w:r>
           </w:p>
         </w:tc>
@@ -29676,7 +29710,7 @@
                 <w:szCs w:val="12"/>
                 <w:lang w:val="en-US"/>
               </w:rPr>
-              <w:t xml:space="preserve">%10,5</w:t>
+              <w:t xml:space="preserve">%11,5</w:t>
             </w:r>
           </w:p>
         </w:tc>
@@ -29702,7 +29736,7 @@
                 <w:szCs w:val="12"/>
                 <w:lang w:val="en-US"/>
               </w:rPr>
-              <w:t xml:space="preserve">%56,2</w:t>
+              <w:t xml:space="preserve">%58,5</w:t>
             </w:r>
           </w:p>
         </w:tc>
@@ -29728,7 +29762,7 @@
                 <w:szCs w:val="12"/>
                 <w:lang w:val="en-US"/>
               </w:rPr>
-              <w:t xml:space="preserve">%15,3</w:t>
+              <w:t xml:space="preserve">%14,5</w:t>
             </w:r>
           </w:p>
         </w:tc>
@@ -29754,7 +29788,7 @@
                 <w:szCs w:val="12"/>
                 <w:lang w:val="en-US"/>
               </w:rPr>
-              <w:t xml:space="preserve">+%25,0</w:t>
+              <w:t xml:space="preserve">+%24,0</w:t>
             </w:r>
           </w:p>
         </w:tc>
@@ -29811,7 +29845,7 @@
                 <w:szCs w:val="12"/>
                 <w:lang w:val="en-US"/>
               </w:rPr>
-              <w:t xml:space="preserve">0,043</w:t>
+              <w:t xml:space="preserve">0,617</w:t>
             </w:r>
           </w:p>
         </w:tc>
@@ -29837,7 +29871,7 @@
                 <w:szCs w:val="12"/>
                 <w:lang w:val="en-US"/>
               </w:rPr>
-              <w:t xml:space="preserve">%18,4</w:t>
+              <w:t xml:space="preserve">%17,6</w:t>
             </w:r>
           </w:p>
         </w:tc>
@@ -29863,7 +29897,7 @@
                 <w:szCs w:val="12"/>
                 <w:lang w:val="en-US"/>
               </w:rPr>
-              <w:t xml:space="preserve">%72,3</w:t>
+              <w:t xml:space="preserve">%70,0</w:t>
             </w:r>
           </w:p>
         </w:tc>
@@ -29915,7 +29949,7 @@
                 <w:szCs w:val="12"/>
                 <w:lang w:val="en-US"/>
               </w:rPr>
-              <w:t xml:space="preserve">+%43,8</w:t>
+              <w:t xml:space="preserve">+%42,7</w:t>
             </w:r>
           </w:p>
         </w:tc>
@@ -29978,7 +30012,7 @@
                 <w:szCs w:val="12"/>
                 <w:lang w:val="en-US"/>
               </w:rPr>
-              <w:t xml:space="preserve">0,018</w:t>
+              <w:t xml:space="preserve">0,393</w:t>
             </w:r>
           </w:p>
         </w:tc>
@@ -30007,7 +30041,7 @@
                 <w:szCs w:val="12"/>
                 <w:lang w:val="en-US"/>
               </w:rPr>
-              <w:t xml:space="preserve">%32,4</w:t>
+              <w:t xml:space="preserve">%31,4</w:t>
             </w:r>
           </w:p>
         </w:tc>
@@ -30036,7 +30070,7 @@
                 <w:szCs w:val="12"/>
                 <w:lang w:val="en-US"/>
               </w:rPr>
-              <w:t xml:space="preserve">%85,9</w:t>
+              <w:t xml:space="preserve">%83,5</w:t>
             </w:r>
           </w:p>
         </w:tc>
@@ -30094,7 +30128,7 @@
                 <w:szCs w:val="12"/>
                 <w:lang w:val="en-US"/>
               </w:rPr>
-              <w:t xml:space="preserve">+%64,9</w:t>
+              <w:t xml:space="preserve">+%63,2</w:t>
             </w:r>
           </w:p>
         </w:tc>
@@ -30199,7 +30233,7 @@
         <w:rPr>
           <w:w w:val="110"/>
         </w:rPr>
-        <w:t xml:space="preserve">Çoklu doğrusallık: nihai özellik kümesinin 53 sayısal özelliği için varyans şişirme faktörleri 150.000 uçuşluk bir eğitim örneklemi üzerinde hesaplanmıştır (Tablo 13, Şekil 16). 20 özelliğin VIF değeri 10'un üzerindedir ve 27 özellik çiftinin mutlak korelasyonu en az 0,8'dir (O'Brien, 2007). En yüksek değerler iç içe geçmiş geçmiş toplulaştırmalara (7 günlük ve önceki gün, ülke geneli ve havalimanı düzeyi) ve sinüs/kosinüs takvim kodlamalarına aittir. Gradyan artırmalı ağaçlar tahmin açısından eş doğrusallığa dayanıklıdır, ancak SHAP önemi ilişkili özellikler arasında bölünür.</w:t>
+        <w:t xml:space="preserve">Çoklu doğrusallık: nihai özellik kümesinin 53 sayısal özelliği için varyans şişirme faktörleri 150.000 uçuşluk bir eğitim örneklemi üzerinde hesaplanmıştır (Tablo 13, Şekil 16). 21 özelliğin VIF değeri 10'un üzerindedir ve 26 özellik çiftinin mutlak korelasyonu en az 0,8'dir (O'Brien, 2007). En yüksek değerler iç içe geçmiş geçmiş toplulaştırmalara (7 günlük ve önceki gün, ülke geneli ve havalimanı düzeyi) ve sinüs/kosinüs takvim kodlamalarına aittir. Gradyan artırmalı ağaçlar tahmin açısından eş doğrusallığa dayanıklıdır, ancak SHAP önemi ilişkili özellikler arasında bölünür.</w:t>
       </w:r>
     </w:p>
     <w:p>
@@ -30340,7 +30374,7 @@
                 <w:lang w:val="en-US"/>
               </w:rPr>
               <w:lastRenderedPageBreak/>
-              <w:t>H_NAT_D7_DELAY15</w:t>
+              <w:t xml:space="preserve">H_NAT_D7_DELAY15</w:t>
             </w:r>
           </w:p>
         </w:tc>
@@ -30366,7 +30400,7 @@
                 <w:szCs w:val="12"/>
                 <w:lang w:val="en-US"/>
               </w:rPr>
-              <w:t xml:space="preserve">152,9</w:t>
+              <w:t xml:space="preserve">153,7</w:t>
             </w:r>
           </w:p>
         </w:tc>
@@ -30396,7 +30430,7 @@
                 <w:szCs w:val="12"/>
                 <w:lang w:val="en-US"/>
               </w:rPr>
-              <w:t>H_NAT_D7_MEANDELAY</w:t>
+              <w:t xml:space="preserve">H_NAT_D7_MEANDELAY</w:t>
             </w:r>
           </w:p>
         </w:tc>
@@ -30422,7 +30456,7 @@
                 <w:szCs w:val="12"/>
                 <w:lang w:val="en-US"/>
               </w:rPr>
-              <w:t xml:space="preserve">151,4</w:t>
+              <w:t xml:space="preserve">152,0</w:t>
             </w:r>
           </w:p>
         </w:tc>
@@ -30452,7 +30486,7 @@
                 <w:szCs w:val="12"/>
                 <w:lang w:val="en-US"/>
               </w:rPr>
-              <w:t>D1_tavg</w:t>
+              <w:t xml:space="preserve">D1_tavg</w:t>
             </w:r>
           </w:p>
         </w:tc>
@@ -30508,7 +30542,7 @@
                 <w:szCs w:val="12"/>
                 <w:lang w:val="en-US"/>
               </w:rPr>
-              <w:t>H_NAT_D1_DELAY15</w:t>
+              <w:t xml:space="preserve">H_NAT_D1_DELAY15</w:t>
             </w:r>
           </w:p>
         </w:tc>
@@ -30534,7 +30568,7 @@
                 <w:szCs w:val="12"/>
                 <w:lang w:val="en-US"/>
               </w:rPr>
-              <w:t xml:space="preserve">65,3</w:t>
+              <w:t xml:space="preserve">65,7</w:t>
             </w:r>
           </w:p>
         </w:tc>
@@ -30564,7 +30598,7 @@
                 <w:szCs w:val="12"/>
                 <w:lang w:val="en-US"/>
               </w:rPr>
-              <w:t>H_NAT_D1_MEANDELAY</w:t>
+              <w:t xml:space="preserve">H_NAT_D1_MEANDELAY</w:t>
             </w:r>
           </w:p>
         </w:tc>
@@ -30590,7 +30624,7 @@
                 <w:szCs w:val="12"/>
                 <w:lang w:val="en-US"/>
               </w:rPr>
-              <w:t xml:space="preserve">60,5</w:t>
+              <w:t xml:space="preserve">61,3</w:t>
             </w:r>
           </w:p>
         </w:tc>
@@ -30620,7 +30654,7 @@
                 <w:szCs w:val="12"/>
                 <w:lang w:val="en-US"/>
               </w:rPr>
-              <w:t>DOY_COS</w:t>
+              <w:t xml:space="preserve">DOY_COS</w:t>
             </w:r>
           </w:p>
         </w:tc>
@@ -30676,7 +30710,7 @@
                 <w:szCs w:val="12"/>
                 <w:lang w:val="en-US"/>
               </w:rPr>
-              <w:t>MONTH_COS</w:t>
+              <w:t xml:space="preserve">MONTH_COS</w:t>
             </w:r>
           </w:p>
         </w:tc>
@@ -30732,7 +30766,7 @@
                 <w:szCs w:val="12"/>
                 <w:lang w:val="en-US"/>
               </w:rPr>
-              <w:t>MONTH_SIN</w:t>
+              <w:t xml:space="preserve">MONTH_SIN</w:t>
             </w:r>
           </w:p>
         </w:tc>
@@ -30788,7 +30822,7 @@
                 <w:szCs w:val="12"/>
                 <w:lang w:val="en-US"/>
               </w:rPr>
-              <w:t>DOY_SIN</w:t>
+              <w:t xml:space="preserve">DOY_SIN</w:t>
             </w:r>
           </w:p>
         </w:tc>
@@ -30847,7 +30881,7 @@
                 <w:szCs w:val="12"/>
                 <w:lang w:val="en-US"/>
               </w:rPr>
-              <w:t>L_NAT_MEANDELAY</w:t>
+              <w:t xml:space="preserve">H_AIR_D7_DELAY15</w:t>
             </w:r>
           </w:p>
         </w:tc>
@@ -30876,7 +30910,7 @@
                 <w:szCs w:val="12"/>
                 <w:lang w:val="en-US"/>
               </w:rPr>
-              <w:t xml:space="preserve">27,8</w:t>
+              <w:t xml:space="preserve">27,1</w:t>
             </w:r>
           </w:p>
         </w:tc>
@@ -30913,7 +30947,7 @@
         <w:rPr>
           <w:w w:val="110"/>
         </w:rPr>
-        <w:t xml:space="preserve">Gecikme modelinde en etkili girdiler havayolu, tarifeli kalkış dakikası, havalimanları ve yakın dönem havayolu düzeyindeki gecikme oranlarıdır (Şekil 8).</w:t>
+        <w:t xml:space="preserve">Gecikme modelinde en etkili girdiler havayolu, tarifeli kalkış ve varış dakikaları ve havalimanlarıdır (Şekil 8).</w:t>
       </w:r>
     </w:p>
     <w:p>
@@ -31035,7 +31069,7 @@
         <w:rPr>
           <w:w w:val="110"/>
         </w:rPr>
-        <w:t xml:space="preserve">Hata analizi: ağırlıksız Mod B gecikme modelinde 15 dakikadan fazla geç kalkan 177.476 uçuş zamanında olarak tahmin edilmiş, buna karşın yalnızca 36.146 zamanında uçuş gecikmeli olarak tahmin edilmiştir. Bu türden yanlış sınıflandırmalar kaçırılan uyarılarla sonuçlanır; sınıf ağırlıklı model bu dengeyi tersine çevirir. Gecikme modeli için parasal bir etki türetilmemiştir.</w:t>
+        <w:t xml:space="preserve">Hata analizi: ağırlıksız Mod B gecikme modelinde 15 dakikadan fazla geç kalkan 177.026 uçuş zamanında olarak tahmin edilmiş, buna karşın yalnızca 36.958 zamanında uçuş gecikmeli olarak tahmin edilmiştir. Bu türden yanlış sınıflandırmalar kaçırılan uyarılarla sonuçlanır; sınıf ağırlıklı model bu dengeyi tersine çevirir. Gecikme modeli için parasal bir etki türetilmemiştir.</w:t>
       </w:r>
     </w:p>
     <w:p>
@@ -31052,7 +31086,7 @@
         <w:rPr>
           <w:w w:val="110"/>
         </w:rPr>
-        <w:t xml:space="preserve">Özetle her iki model de kesin tahmin edicilerden çok risk göstergeleri olarak yararlıdır: iptal modeli riski yoğunlaştırmakta (Mod B'de temel oranın yaklaşık altı-yedi katı), neden modeli çoğunluk sınıfı tabanını açıkça geçmekte, gecikme modeli ise temel oranların ötesinde yalnızca mütevazı bilgi sunmaktadır.</w:t>
+        <w:t xml:space="preserve">Özetle her iki model de kesin tahmin edicilerden çok risk göstergeleri olarak yararlıdır: iptal modeli riski yoğunlaştırmakta (Mod B'de temel oranın yaklaşık altı katı), neden modeli çoğunluk sınıfı tabanını açıkça geçmekte, gecikme modeli ise temel oranların ötesinde yalnızca mütevazı bilgi sunmaktadır.</w:t>
       </w:r>
     </w:p>
     <w:p>
@@ -31621,7 +31655,7 @@
                 <w:szCs w:val="12"/>
                 <w:lang w:val="en-US"/>
               </w:rPr>
-              <w:t xml:space="preserve">0,196</w:t>
+              <w:t xml:space="preserve">0,180</w:t>
             </w:r>
           </w:p>
         </w:tc>
@@ -31647,7 +31681,7 @@
                 <w:szCs w:val="12"/>
                 <w:lang w:val="en-US"/>
               </w:rPr>
-              <w:t xml:space="preserve">0,857</w:t>
+              <w:t xml:space="preserve">0,849</w:t>
             </w:r>
           </w:p>
         </w:tc>
@@ -31673,7 +31707,7 @@
                 <w:szCs w:val="12"/>
                 <w:lang w:val="en-US"/>
               </w:rPr>
-              <w:t xml:space="preserve">0,209</w:t>
+              <w:t xml:space="preserve">0,222</w:t>
             </w:r>
           </w:p>
         </w:tc>
@@ -31699,7 +31733,7 @@
                 <w:szCs w:val="12"/>
                 <w:lang w:val="en-US"/>
               </w:rPr>
-              <w:t xml:space="preserve">0,368</w:t>
+              <w:t xml:space="preserve">0,319</w:t>
             </w:r>
           </w:p>
         </w:tc>
@@ -31725,7 +31759,7 @@
                 <w:szCs w:val="12"/>
                 <w:lang w:val="en-US"/>
               </w:rPr>
-              <w:t xml:space="preserve">0,266</w:t>
+              <w:t xml:space="preserve">0,262</w:t>
             </w:r>
           </w:p>
         </w:tc>
@@ -31967,7 +32001,7 @@
                 <w:szCs w:val="12"/>
                 <w:lang w:val="en-US"/>
               </w:rPr>
-              <w:t xml:space="preserve">0,806</w:t>
+              <w:t xml:space="preserve">0,807</w:t>
             </w:r>
           </w:p>
         </w:tc>
@@ -31993,7 +32027,7 @@
                 <w:szCs w:val="12"/>
                 <w:lang w:val="en-US"/>
               </w:rPr>
-              <w:t xml:space="preserve">0,182</w:t>
+              <w:t xml:space="preserve">0,183</w:t>
             </w:r>
           </w:p>
         </w:tc>
@@ -32019,7 +32053,7 @@
                 <w:szCs w:val="12"/>
                 <w:lang w:val="en-US"/>
               </w:rPr>
-              <w:t xml:space="preserve">0,261</w:t>
+              <w:t xml:space="preserve">0,252</w:t>
             </w:r>
           </w:p>
         </w:tc>
@@ -32045,7 +32079,7 @@
                 <w:szCs w:val="12"/>
                 <w:lang w:val="en-US"/>
               </w:rPr>
-              <w:t xml:space="preserve">0,214</w:t>
+              <w:t xml:space="preserve">0,212</w:t>
             </w:r>
           </w:p>
         </w:tc>
@@ -32261,7 +32295,7 @@
                 <w:szCs w:val="12"/>
                 <w:lang w:val="en-US"/>
               </w:rPr>
-              <w:t xml:space="preserve">0,164</w:t>
+              <w:t xml:space="preserve">0,165</w:t>
             </w:r>
           </w:p>
         </w:tc>
@@ -32287,7 +32321,7 @@
                 <w:szCs w:val="12"/>
                 <w:lang w:val="en-US"/>
               </w:rPr>
-              <w:t xml:space="preserve">0,819</w:t>
+              <w:t xml:space="preserve">0,817</w:t>
             </w:r>
           </w:p>
         </w:tc>
@@ -32313,7 +32347,7 @@
                 <w:szCs w:val="12"/>
                 <w:lang w:val="en-US"/>
               </w:rPr>
-              <w:t xml:space="preserve">0,161</w:t>
+              <w:t xml:space="preserve">0,192</w:t>
             </w:r>
           </w:p>
         </w:tc>
@@ -32339,7 +32373,7 @@
                 <w:szCs w:val="12"/>
                 <w:lang w:val="en-US"/>
               </w:rPr>
-              <w:t xml:space="preserve">0,418</w:t>
+              <w:t xml:space="preserve">0,280</w:t>
             </w:r>
           </w:p>
         </w:tc>
@@ -32365,7 +32399,7 @@
                 <w:szCs w:val="12"/>
                 <w:lang w:val="en-US"/>
               </w:rPr>
-              <w:t xml:space="preserve">0,232</w:t>
+              <w:t xml:space="preserve">0,228</w:t>
             </w:r>
           </w:p>
         </w:tc>
@@ -32581,7 +32615,7 @@
                 <w:szCs w:val="12"/>
                 <w:lang w:val="en-US"/>
               </w:rPr>
-              <w:t xml:space="preserve">0,186</w:t>
+              <w:t xml:space="preserve">0,188</w:t>
             </w:r>
           </w:p>
         </w:tc>
@@ -32633,7 +32667,7 @@
                 <w:szCs w:val="12"/>
                 <w:lang w:val="en-US"/>
               </w:rPr>
-              <w:t xml:space="preserve">0,235</w:t>
+              <w:t xml:space="preserve">0,232</w:t>
             </w:r>
           </w:p>
         </w:tc>
@@ -32659,7 +32693,7 @@
                 <w:szCs w:val="12"/>
                 <w:lang w:val="en-US"/>
               </w:rPr>
-              <w:t xml:space="preserve">0,277</w:t>
+              <w:t xml:space="preserve">0,290</w:t>
             </w:r>
           </w:p>
         </w:tc>
@@ -32685,7 +32719,7 @@
                 <w:szCs w:val="12"/>
                 <w:lang w:val="en-US"/>
               </w:rPr>
-              <w:t xml:space="preserve">0,255</w:t>
+              <w:t xml:space="preserve">0,258</w:t>
             </w:r>
           </w:p>
         </w:tc>
@@ -32907,7 +32941,7 @@
                 <w:szCs w:val="12"/>
                 <w:lang w:val="en-US"/>
               </w:rPr>
-              <w:t xml:space="preserve">0,192</w:t>
+              <w:t xml:space="preserve">0,173</w:t>
             </w:r>
           </w:p>
         </w:tc>
@@ -32936,7 +32970,7 @@
                 <w:szCs w:val="12"/>
                 <w:lang w:val="en-US"/>
               </w:rPr>
-              <w:t xml:space="preserve">0,854</w:t>
+              <w:t xml:space="preserve">0,847</w:t>
             </w:r>
           </w:p>
         </w:tc>
@@ -32965,7 +32999,7 @@
                 <w:szCs w:val="12"/>
                 <w:lang w:val="en-US"/>
               </w:rPr>
-              <w:t xml:space="preserve">0,220</w:t>
+              <w:t xml:space="preserve">0,217</w:t>
             </w:r>
           </w:p>
         </w:tc>
@@ -32994,7 +33028,7 @@
                 <w:szCs w:val="12"/>
                 <w:lang w:val="en-US"/>
               </w:rPr>
-              <w:t xml:space="preserve">0,325</w:t>
+              <w:t xml:space="preserve">0,294</w:t>
             </w:r>
           </w:p>
         </w:tc>
@@ -33023,7 +33057,7 @@
                 <w:szCs w:val="12"/>
                 <w:lang w:val="en-US"/>
               </w:rPr>
-              <w:t xml:space="preserve">0,263</w:t>
+              <w:t xml:space="preserve">0,249</w:t>
             </w:r>
           </w:p>
         </w:tc>
@@ -33054,7 +33088,7 @@
         <w:rPr>
           <w:w w:val="110"/>
         </w:rPr>
-        <w:t xml:space="preserve">Beş algoritmanın sıralı test PR-AUC değerleri: Mod A - XGBoost 0,119, rastgele orman 0,113, histogram tabanlı gradyan artırma 0,102, lojistik regresyon 0,101, karar ağacı 0,094; Mod B - XGBoost 0,196, histogram tabanlı gradyan artırma 0,192, rastgele orman 0,186, karar ağacı 0,164, lojistik regresyon 0,140 (bilgisiz taban 0,029). XGBoost her iki modda da en yüksek veya ikinci en yüksek PR-AUC değerine sahiptir.</w:t>
+        <w:t xml:space="preserve">Beş algoritmanın sıralı test PR-AUC değerleri: Mod A - XGBoost 0,119, rastgele orman 0,113, histogram tabanlı gradyan artırma 0,102, lojistik regresyon 0,101, karar ağacı 0,094; Mod B - rastgele orman 0,188, XGBoost 0,180, histogram tabanlı gradyan artırma 0,173, karar ağacı 0,165, lojistik regresyon 0,140 (bilgisiz taban 0,029). XGBoost, Mod A'da en yüksek, Mod B'de ise rastgele ormanın ardından ikinci en yüksek PR-AUC değerine sahiptir.</w:t>
       </w:r>
     </w:p>
     <w:p>
@@ -33071,7 +33105,7 @@
         <w:rPr>
           <w:w w:val="110"/>
         </w:rPr>
-        <w:t xml:space="preserve">Her algoritma için gün içi durum sıralama kalitesini iyileştirmektedir (Mod A'dan Mod B'ye), örneğin lojistik regresyon 0,101'den 0,140'a, XGBoost 0,119'dan 0,196'ya. Bilgi kaynağından sağlanan kazanç algoritmalar arasındaki farklardan daha büyüktür.</w:t>
+        <w:t xml:space="preserve">Her algoritma için gün içi durum sıralama kalitesini iyileştirmektedir (Mod A'dan Mod B'ye), örneğin lojistik regresyon 0,101'den 0,140'a, XGBoost 0,119'dan 0,180'e. Bilgi kaynağından sağlanan kazanç algoritmalar arasındaki farklardan daha büyüktür.</w:t>
       </w:r>
     </w:p>
     <w:p>
@@ -33088,7 +33122,7 @@
         <w:rPr>
           <w:w w:val="110"/>
         </w:rPr>
-        <w:t xml:space="preserve">Ayarlanmamış olsalar bile histogram tabanlı gradyan artırma (0,192) ve rastgele orman (0,186) Mod B'de XGBoost'a (0,196) yaklaşmakta, lojistik regresyon (0,140) ve karar ağacı (0,164) geride kalmaktadır. Dolayısıyla ayarlanmış artırma modelinin avantajı küçüktür ve bir kısmı ayara ve tüm eğitim uçuşlarının kullanılmasına bağlıdır.</w:t>
+        <w:t xml:space="preserve">Ayarlanmamış olmasına rağmen rastgele orman (0,188) Mod B'de ayarlanmış XGBoost modelini (0,180) hafifçe aşmakta, histogram tabanlı gradyan artırma (0,173) yaklaşmakta, karar ağacı (0,165) ve lojistik regresyon (0,140) ise geride kalmaktadır. Dolayısıyla ayarlanmış artırma modelinin Mod B'de açık bir avantajı yoktur; bu durum, doğrulama döneminin neredeyse eşdeğer yapılandırmaları ayırt etme yeteneğinin sınırlı olmasıyla tutarlıdır (Bölüm 4.4.3).</w:t>
       </w:r>
     </w:p>
     <w:p>
@@ -33105,7 +33139,7 @@
         <w:rPr>
           <w:w w:val="110"/>
         </w:rPr>
-        <w:t xml:space="preserve">Bu nedenle mütevazı bir avantajın ötesinde algoritmik üstünlük iddia edilmemektedir; girdilerin seçimi algoritmanın seçiminden daha önemlidir.</w:t>
+        <w:t xml:space="preserve">Bu nedenle algoritmik üstünlük iddia edilmemektedir; girdilerin seçimi algoritmanın seçiminden daha önemlidir.</w:t>
       </w:r>
     </w:p>
     <w:p>
@@ -33503,7 +33537,7 @@
                 <w:szCs w:val="12"/>
                 <w:lang w:val="en-US"/>
               </w:rPr>
-              <w:t xml:space="preserve">0,739</w:t>
+              <w:t xml:space="preserve">0,750</w:t>
             </w:r>
           </w:p>
         </w:tc>
@@ -33529,7 +33563,7 @@
                 <w:szCs w:val="12"/>
                 <w:lang w:val="en-US"/>
               </w:rPr>
-              <w:t xml:space="preserve">0,569</w:t>
+              <w:t xml:space="preserve">0,573</w:t>
             </w:r>
           </w:p>
         </w:tc>
@@ -33555,7 +33589,7 @@
                 <w:szCs w:val="12"/>
                 <w:lang w:val="en-US"/>
               </w:rPr>
-              <w:t xml:space="preserve">0,572</w:t>
+              <w:t xml:space="preserve">0,576</w:t>
             </w:r>
           </w:p>
         </w:tc>
@@ -33581,7 +33615,7 @@
                 <w:szCs w:val="12"/>
                 <w:lang w:val="en-US"/>
               </w:rPr>
-              <w:t xml:space="preserve">0,846</w:t>
+              <w:t xml:space="preserve">0,850</w:t>
             </w:r>
           </w:p>
         </w:tc>
@@ -33771,7 +33805,7 @@
                 <w:szCs w:val="12"/>
                 <w:lang w:val="en-US"/>
               </w:rPr>
-              <w:t xml:space="preserve">0,774</w:t>
+              <w:t xml:space="preserve">0,773</w:t>
             </w:r>
           </w:p>
         </w:tc>
@@ -33797,7 +33831,7 @@
                 <w:szCs w:val="12"/>
                 <w:lang w:val="en-US"/>
               </w:rPr>
-              <w:t xml:space="preserve">0,589</w:t>
+              <w:t xml:space="preserve">0,592</w:t>
             </w:r>
           </w:p>
         </w:tc>
@@ -33823,7 +33857,7 @@
                 <w:szCs w:val="12"/>
                 <w:lang w:val="en-US"/>
               </w:rPr>
-              <w:t xml:space="preserve">0,575</w:t>
+              <w:t xml:space="preserve">0,578</w:t>
             </w:r>
           </w:p>
         </w:tc>
@@ -34039,7 +34073,7 @@
                 <w:szCs w:val="12"/>
                 <w:lang w:val="en-US"/>
               </w:rPr>
-              <w:t xml:space="preserve">0,547</w:t>
+              <w:t xml:space="preserve">0,567</w:t>
             </w:r>
           </w:p>
         </w:tc>
@@ -34065,7 +34099,7 @@
                 <w:szCs w:val="12"/>
                 <w:lang w:val="en-US"/>
               </w:rPr>
-              <w:t xml:space="preserve">0,406</w:t>
+              <w:t xml:space="preserve">0,430</w:t>
             </w:r>
           </w:p>
         </w:tc>
@@ -34091,7 +34125,7 @@
                 <w:szCs w:val="12"/>
                 <w:lang w:val="en-US"/>
               </w:rPr>
-              <w:t xml:space="preserve">0,405</w:t>
+              <w:t xml:space="preserve">0,421</w:t>
             </w:r>
           </w:p>
         </w:tc>
@@ -34117,7 +34151,7 @@
                 <w:szCs w:val="12"/>
                 <w:lang w:val="en-US"/>
               </w:rPr>
-              <w:t xml:space="preserve">0,621</w:t>
+              <w:t xml:space="preserve">0,650</w:t>
             </w:r>
           </w:p>
         </w:tc>
@@ -34307,7 +34341,7 @@
                 <w:szCs w:val="12"/>
                 <w:lang w:val="en-US"/>
               </w:rPr>
-              <w:t xml:space="preserve">0,649</w:t>
+              <w:t xml:space="preserve">0,661</w:t>
             </w:r>
           </w:p>
         </w:tc>
@@ -34333,7 +34367,7 @@
                 <w:szCs w:val="12"/>
                 <w:lang w:val="en-US"/>
               </w:rPr>
-              <w:t xml:space="preserve">0,437</w:t>
+              <w:t xml:space="preserve">0,442</w:t>
             </w:r>
           </w:p>
         </w:tc>
@@ -34359,7 +34393,7 @@
                 <w:szCs w:val="12"/>
                 <w:lang w:val="en-US"/>
               </w:rPr>
-              <w:t xml:space="preserve">0,450</w:t>
+              <w:t xml:space="preserve">0,452</w:t>
             </w:r>
           </w:p>
         </w:tc>
@@ -34385,7 +34419,7 @@
                 <w:szCs w:val="12"/>
                 <w:lang w:val="en-US"/>
               </w:rPr>
-              <w:t xml:space="preserve">0,737</w:t>
+              <w:t xml:space="preserve">0,742</w:t>
             </w:r>
           </w:p>
         </w:tc>
@@ -34581,7 +34615,7 @@
                 <w:szCs w:val="12"/>
                 <w:lang w:val="en-US"/>
               </w:rPr>
-              <w:t xml:space="preserve">0,671</w:t>
+              <w:t xml:space="preserve">0,686</w:t>
             </w:r>
           </w:p>
         </w:tc>
@@ -34610,7 +34644,7 @@
                 <w:szCs w:val="12"/>
                 <w:lang w:val="en-US"/>
               </w:rPr>
-              <w:t xml:space="preserve">0,508</w:t>
+              <w:t xml:space="preserve">0,517</w:t>
             </w:r>
           </w:p>
         </w:tc>
@@ -34639,7 +34673,7 @@
                 <w:szCs w:val="12"/>
                 <w:lang w:val="en-US"/>
               </w:rPr>
-              <w:t xml:space="preserve">0,521</w:t>
+              <w:t xml:space="preserve">0,530</w:t>
             </w:r>
           </w:p>
         </w:tc>
@@ -34668,7 +34702,7 @@
                 <w:szCs w:val="12"/>
                 <w:lang w:val="en-US"/>
               </w:rPr>
-              <w:t xml:space="preserve">0,789</w:t>
+              <w:t xml:space="preserve">0,803</w:t>
             </w:r>
           </w:p>
         </w:tc>
@@ -34699,7 +34733,7 @@
         <w:rPr>
           <w:w w:val="110"/>
         </w:rPr>
-        <w:t xml:space="preserve">İptal nedeni için sıralı test doğrulukları: Mod A - lojistik regresyon %76,0, XGBoost %70,7, histogram tabanlı gradyan artırma %64,7, rastgele orman %63,7, karar ağacı %50,7; Mod B - lojistik regresyon %77,4, XGBoost %73,9, histogram tabanlı gradyan artırma %67,1, rastgele orman %64,9, karar ağacı %54,7. Çoğunluk sınıfı tabanı %60,2'dir.</w:t>
+        <w:t xml:space="preserve">İptal nedeni için sıralı test doğrulukları: Mod A - lojistik regresyon %76,0, XGBoost %70,7, histogram tabanlı gradyan artırma %64,7, rastgele orman %63,7, karar ağacı %50,7; Mod B - lojistik regresyon %77,3, XGBoost %75,0, histogram tabanlı gradyan artırma %68,6, rastgele orman %66,1, karar ağacı %56,7. Çoğunluk sınıfı tabanı %60,2'dir.</w:t>
       </w:r>
     </w:p>
     <w:p>
@@ -34716,7 +34750,7 @@
         <w:rPr>
           <w:w w:val="110"/>
         </w:rPr>
-        <w:t xml:space="preserve">Algoritmaların sıralaması dönemler arasında farklılaşmaktadır. Doğrulama döneminde XGBoost en iyisiydi (doğruluk Mod A'da %68,7, Mod B'de %69,4) ve lojistik regresyonun (%65,3 ve %67,0) önündeydi; oysa test döneminde lojistik regresyon %76,0 ve %77,4'e ulaşırken XGBoost %70,7 ve %73,9'da kalmıştır. Nedenlerin dağılımı dönemler arasında kaymaktadır (hava durumu kaynaklı pay eğitimde %52, test döneminde %60) ve ayarlanmış artırmalı ağaçlar bu kaymaya doğrusal bir modelden daha az dayanıklı olmuştur.</w:t>
+        <w:t xml:space="preserve">Algoritmaların sıralaması dönemler arasında farklılaşmaktadır. Doğrulama döneminde XGBoost en iyisiydi (doğruluk Mod A'da %68,7, Mod B'de %70,3) ve lojistik regresyonun (%65,3 ve %67,5) önündeydi; oysa test döneminde lojistik regresyon %76,0 ve %77,3'e ulaşırken XGBoost %70,7 ve %75,0'da kalmıştır. Nedenlerin dağılımı dönemler arasında kaymaktadır (hava durumu kaynaklı pay eğitimde %52, test döneminde %60) ve ayarlanmış artırmalı ağaçlar bu kaymaya doğrusal bir modelden daha az dayanıklı olmuştur.</w:t>
       </w:r>
     </w:p>
     <w:p>
@@ -35376,7 +35410,7 @@
                 <w:szCs w:val="12"/>
                 <w:lang w:val="en-US"/>
               </w:rPr>
-              <w:t xml:space="preserve">0,299</w:t>
+              <w:t xml:space="preserve">0,300</w:t>
             </w:r>
           </w:p>
         </w:tc>
@@ -35510,7 +35544,7 @@
                 <w:szCs w:val="12"/>
                 <w:lang w:val="en-US"/>
               </w:rPr>
-              <w:t xml:space="preserve">0,421</w:t>
+              <w:t xml:space="preserve">0,419</w:t>
             </w:r>
           </w:p>
         </w:tc>
@@ -35588,7 +35622,7 @@
                 <w:szCs w:val="12"/>
                 <w:lang w:val="en-US"/>
               </w:rPr>
-              <w:t xml:space="preserve">0,660</w:t>
+              <w:t xml:space="preserve">0,661</w:t>
             </w:r>
           </w:p>
         </w:tc>
@@ -35908,7 +35942,7 @@
                 <w:szCs w:val="12"/>
                 <w:lang w:val="en-US"/>
               </w:rPr>
-              <w:t xml:space="preserve">0,665</w:t>
+              <w:t xml:space="preserve">0,664</w:t>
             </w:r>
           </w:p>
         </w:tc>
@@ -36150,7 +36184,7 @@
                 <w:szCs w:val="12"/>
                 <w:lang w:val="en-US"/>
               </w:rPr>
-              <w:t xml:space="preserve">0,605</w:t>
+              <w:t xml:space="preserve">0,606</w:t>
             </w:r>
           </w:p>
         </w:tc>
@@ -36176,7 +36210,7 @@
                 <w:szCs w:val="12"/>
                 <w:lang w:val="en-US"/>
               </w:rPr>
-              <w:t xml:space="preserve">0,292</w:t>
+              <w:t xml:space="preserve">0,287</w:t>
             </w:r>
           </w:p>
         </w:tc>
@@ -36202,7 +36236,7 @@
                 <w:szCs w:val="12"/>
                 <w:lang w:val="en-US"/>
               </w:rPr>
-              <w:t xml:space="preserve">0,308</w:t>
+              <w:t xml:space="preserve">0,304</w:t>
             </w:r>
           </w:p>
         </w:tc>
@@ -36496,7 +36530,7 @@
                 <w:szCs w:val="12"/>
                 <w:lang w:val="en-US"/>
               </w:rPr>
-              <w:t xml:space="preserve">0,264</w:t>
+              <w:t xml:space="preserve">0,262</w:t>
             </w:r>
           </w:p>
         </w:tc>
@@ -36522,7 +36556,7 @@
                 <w:szCs w:val="12"/>
                 <w:lang w:val="en-US"/>
               </w:rPr>
-              <w:t xml:space="preserve">0,295</w:t>
+              <w:t xml:space="preserve">0,294</w:t>
             </w:r>
           </w:p>
         </w:tc>
@@ -36548,7 +36582,7 @@
                 <w:szCs w:val="12"/>
                 <w:lang w:val="en-US"/>
               </w:rPr>
-              <w:t xml:space="preserve">0,669</w:t>
+              <w:t xml:space="preserve">0,668</w:t>
             </w:r>
           </w:p>
         </w:tc>
@@ -36574,7 +36608,7 @@
                 <w:szCs w:val="12"/>
                 <w:lang w:val="en-US"/>
               </w:rPr>
-              <w:t xml:space="preserve">0,707</w:t>
+              <w:t xml:space="preserve">0,706</w:t>
             </w:r>
           </w:p>
         </w:tc>
@@ -36825,7 +36859,7 @@
                 <w:szCs w:val="12"/>
                 <w:lang w:val="en-US"/>
               </w:rPr>
-              <w:t xml:space="preserve">0,297</w:t>
+              <w:t xml:space="preserve">0,298</w:t>
             </w:r>
           </w:p>
         </w:tc>
@@ -36943,7 +36977,7 @@
         <w:rPr>
           <w:w w:val="110"/>
         </w:rPr>
-        <w:t xml:space="preserve">Ağırlıksız dört sınıflı gecikme modellerinin test doğrulukları: XGBoost (A) %60,8, histogram tabanlı gradyan artırma (A) %60,5, rastgele orman (A) %60,3, lojistik regresyon (A) %59,8, karar ağacı (A) %59,6, XGBoost (B) %61,9, histogram tabanlı gradyan artırma (B) %61,7, rastgele orman (B) %61,2, lojistik regresyon (B) %60,9, karar ağacı (B) %60,5; çoğunluk sınıfı tabanı %60,0'dır.</w:t>
+        <w:t xml:space="preserve">Ağırlıksız dört sınıflı gecikme modellerinin test doğrulukları: XGBoost (A) %60,8, histogram tabanlı gradyan artırma (A) %60,5, rastgele orman (A) %60,3, lojistik regresyon (A) %59,8, karar ağacı (A) %59,6, XGBoost (B) %61,9, histogram tabanlı gradyan artırma (B) %61,7, rastgele orman (B) %61,2, lojistik regresyon (B) %60,9, karar ağacı (B) %60,6; çoğunluk sınıfı tabanı %60,0'dır.</w:t>
       </w:r>
     </w:p>
     <w:p>
@@ -40746,7 +40780,7 @@
         <w:rPr>
           <w:w w:val="110"/>
         </w:rPr>
-        <w:t xml:space="preserve">Bu sonuçlar, burada iptal tahmini için elde edilen ölçütlerle karşılaştırılamaz: çalışmalar farklı veri kümeleri ve sınıf yaygınlıkları kullanmaktadır ve nadir olay sınıflandırıcısının daha önce yayımlanmış doğruluğu, sınıfa duyarlı ölçütler olmadan bilgilendirici değildir. Bu çalışma, 0,029'luk bilgisiz taban değerine karşılık PR-AUC değerini 0,119 (Mod A) ve 0,196 (Mod B) olarak bildirmektedir.</w:t>
+        <w:t xml:space="preserve">Bu sonuçlar, burada iptal tahmini için elde edilen ölçütlerle karşılaştırılamaz: çalışmalar farklı veri kümeleri ve sınıf yaygınlıkları kullanmaktadır ve nadir olay sınıflandırıcısının daha önce yayımlanmış doğruluğu, sınıfa duyarlı ölçütler olmadan bilgilendirici değildir. Bu çalışma, 0,029'luk bilgisiz taban değerine karşılık PR-AUC değerini 0,119 (Mod A) ve 0,180 (Mod B) olarak bildirmektedir.</w:t>
         <w:lastRenderedPageBreak/>
         <w:t/>
       </w:r>
@@ -46947,7 +46981,7 @@
         <w:rPr>
           <w:w w:val="110"/>
         </w:rPr>
-        <w:t xml:space="preserve">XGBoost; lojistik regresyon, karar ağacı, rastgele orman ve histogram tabanlı gradyan artırma ile karşılaştırılmıştır. İptal ve gecikme tahmininde algoritmalar arasındaki farklar kullanılan bilginin etkisine kıyasla küçük kalmıştır; ancak bu karşılaştırma simetrik değildir (diğer algoritmalar ayarlanmamış ve 1 milyon uçuşluk eğitim alt örneklemi kullanmıştır). İptal nedeninde lojistik regresyon test döneminde XGBoost'u geçmiştir (%76,0 ve %77,4'e karşılık %70,7 ve %73,9), buna karşın doğrulama döneminde daha kötüydü; seçim protokolün gerektirdiği gibi doğrulama dönemini izlemiştir ve bu tutarsızlık, neden görevinin döneme özgü sınıf dağılımlarına ne kadar duyarlı olduğunu göstermektedir.</w:t>
+        <w:t xml:space="preserve">XGBoost; lojistik regresyon, karar ağacı, rastgele orman ve histogram tabanlı gradyan artırma ile karşılaştırılmıştır. İptal ve gecikme tahmininde algoritmalar arasındaki farklar kullanılan bilginin etkisine kıyasla küçük kalmıştır; ancak bu karşılaştırma simetrik değildir (diğer algoritmalar ayarlanmamış ve 1 milyon uçuşluk eğitim alt örneklemi kullanmıştır). İptal nedeninde lojistik regresyon test döneminde XGBoost'u geçmiştir (%76,0 ve %77,3'e karşılık %70,7 ve %75,0), buna karşın doğrulama döneminde daha kötüydü; seçim protokolün gerektirdiği gibi doğrulama dönemini izlemiştir ve bu tutarsızlık, neden görevinin döneme özgü sınıf dağılımlarına ne kadar duyarlı olduğunu göstermektedir.</w:t>
       </w:r>
     </w:p>
     <w:p>
@@ -46964,7 +46998,7 @@
         <w:rPr>
           <w:w w:val="110"/>
         </w:rPr>
-        <w:t xml:space="preserve">İptal tahmini: 0,119 (Mod A) ve 0,196 (Mod B) PR-AUC değerleri bilgisiz düzeyin kabaca 4 ve 7 katına karşılık gelir, ancak yararlı duyarlılıktaki kesinlik düşüktür. Başarım doğrulamadan teste düşmüş ve aylar arasında güçlü biçimde değişmektedir. Bunu iptallerin epizodik doğasına (birkaç aksama günü iptallerin çoğunu oluşturur), dönemler arasındaki bileşim farklarına (test dönemine eksiksiz, daha yoğun kayıtlı tek bir kış ayı egemendir) ve ayar için elverişli olay sayısının sınırlı olmasına bağlıyoruz. Bu etkileri mevcut veriyle ayıramıyoruz. Nadir bir olay hedefinde yüksek doğruluk değerleri tek başlarına bilgilendirici değildir: her uçuş için 'iptal edilmedi' tahmini zaten %97 doğruluk verir.</w:t>
+        <w:t xml:space="preserve">İptal tahmini: 0,119 (Mod A) ve 0,180 (Mod B) PR-AUC değerleri bilgisiz düzeyin kabaca 4 ve 6 katına karşılık gelir, ancak yararlı duyarlılıktaki kesinlik düşüktür. Başarım doğrulamadan teste düşmüş ve aylar arasında güçlü biçimde değişmektedir. Bunu iptallerin epizodik doğasına (birkaç aksama günü iptallerin çoğunu oluşturur), dönemler arasındaki bileşim farklarına (test dönemine eksiksiz, daha yoğun kayıtlı tek bir kış ayı egemendir) ve ayar için elverişli olay sayısının sınırlı olmasına bağlıyoruz. Bu etkileri mevcut veriyle ayıramıyoruz. Nadir bir olay hedefinde yüksek doğruluk değerleri tek başlarına bilgilendirici değildir: her uçuş için 'iptal edilmedi' tahmini zaten %97 doğruluk verir.</w:t>
       </w:r>
     </w:p>
     <w:p>
@@ -46981,7 +47015,7 @@
         <w:rPr>
           <w:w w:val="110"/>
         </w:rPr>
-        <w:t xml:space="preserve">İptal nedeni: %70,7 (Mod A) ve %73,9 (Mod B) doğruluk, çoğunlukla havayolu ve hava durumu kaynaklı iptallerin ayrılması sayesinde %60,2'lik çoğunluk tabanını açıkça aşmaktadır. Ulusal hava sistemi sınıfı nadiren tanınmakta ve nedenlerin dağılımı zamanla kaymaktadır. Güvenlik sınıfı neredeyse yalnızca 2020'ye özgü olduğundan dışlanmıştır.</w:t>
+        <w:t xml:space="preserve">İptal nedeni: %70,7 (Mod A) ve %75,0 (Mod B) doğruluk, çoğunlukla havayolu ve hava durumu kaynaklı iptallerin ayrılması sayesinde %60,2'lik çoğunluk tabanını açıkça aşmaktadır. Ulusal hava sistemi sınıfı nadiren tanınmakta ve nedenlerin dağılımı zamanla kaymaktadır. Güvenlik sınıfı neredeyse yalnızca 2020'ye özgü olduğundan dışlanmıştır.</w:t>
       </w:r>
     </w:p>
     <w:p>
@@ -47051,7 +47085,7 @@
         <w:rPr>
           <w:w w:val="110"/>
         </w:rPr>
-        <w:t xml:space="preserve">Sınırlılıklar: (i) Veri: 2019-2023 kayıtları 3 milyon uçuşluk bir örneklemdir ve tam DOT verisi değildir; test döneminde Eylül-Aralık 2023 ayları yoktur; 2024 verisi tek bir kış ayıdır ve birleştirilmiş test ölçütlerine egemendir. (ii) Hava durumu: yalnızca bir önceki güne ait günlük gözlemler kullanılmıştır; saatlik gözlemler veya tahminler kullanılmamıştır; modeller kalkış anındaki koşulları yakalayamaz. (iii) Coğrafya ve dış geçerlilik: tüm veriler ABD iç hat uçuşlarıdır; sonuçlar başka bölgelere aktarılamayabilir. (iv) Sınıf dengesizliği ve nadir sınıflar neden ve gecikme modelleri için bir güçlük olmaya devam etmektedir. (v) Olası artık sızıntı tümüyle dışlanamaz, ancak geçmiş ve gün içi özellikler otomatik testlerle doğrulanmış ve tüm uydurulan nicelikler yalnızca eğitim dönemini kullanmıştır. (vi) Hiperparametre araması sınırlı, tek tohumlu ve gecikme için bir alt örneklem üzerinde yapılmıştır; karşılaştırma modelleri ayarlanmamıştır. (vii) Hiçbir derin öğrenme modeli uygulanmamış veya değerlendirilmemiştir. (viii) SmartTicket prototipi kullanıcılarla değerlendirilmemiştir; yanıt süresi yalnızca bir geliştirici bilgisayarında süreç içinde ölçülmüş, yük, ölçeklenebilirlik veya güvenlik testi yapılmamıştır.</w:t>
+        <w:t xml:space="preserve">Sınırlılıklar: (i) Veri: 2019-2023 kayıtları 3 milyon uçuşluk bir örneklemdir ve tam DOT verisi değildir; test döneminde Eylül-Aralık 2023 ayları yoktur; 2024 verisi tek bir kış ayıdır ve birleştirilmiş test ölçütlerine egemendir. (ii) Hava durumu: yalnızca bir önceki güne ait günlük gözlemler kullanılmıştır; saatlik gözlemler veya tahminler kullanılmamıştır; modeller kalkış anındaki koşulları yakalayamaz. (iii) Coğrafya ve dış geçerlilik: tüm veriler ABD iç hat uçuşlarıdır; sonuçlar başka bölgelere aktarılamayabilir. (iv) Sınıf dengesizliği ve nadir sınıflar neden ve gecikme modelleri için bir güçlük olmaya devam etmektedir. (v) Olası artık sızıntı tümüyle dışlanamaz, ancak geçmiş ve gün içi özellikler otomatik testlerle doğrulanmış ve tüm uydurulan nicelikler yalnızca eğitim dönemini kullanmıştır. Önceki gün geçmiş özellikleri tam yerel takvim günlerini kullanır; yerel gece yarısından sonraki ilk saatlerde tarifelenen uçuşlar için başka saat dilimlerinin, uçuşun kalkışından kısa süre sonra gerçekleşen olaylarını içerebilir; ancak 06:00'dan (yerel saat) önce tarifelenen uçuşlar (test uçuşlarının %3'ü) çıkarıldığında test ölçütleri yalnızca marjinal olarak değişmektedir (iptal PR-AUC değeri 0,119 yerine 0,117, iptal nedeni doğruluğu %70,7 yerine %70,5). (vi) Hiperparametre araması sınırlı, tek tohumlu ve gecikme için bir alt örneklem üzerinde yapılmıştır; karşılaştırma modelleri ayarlanmamıştır. (vii) Hiçbir derin öğrenme modeli uygulanmamış veya değerlendirilmemiştir. (viii) SmartTicket prototipi kullanıcılarla değerlendirilmemiştir; yanıt süresi yalnızca bir geliştirici bilgisayarında süreç içinde ölçülmüş, yük, ölçeklenebilirlik veya güvenlik testi yapılmamıştır.</w:t>
       </w:r>
     </w:p>
     <w:p>
@@ -47167,7 +47201,7 @@
         <w:rPr>
           <w:w w:val="110"/>
         </w:rPr>
-        <w:t xml:space="preserve">Sonuç. Uçuş iptali, iptal nedeni ve kalkış gecikmesi sınıfı için XGBoost tabanlı üç model kurduk ve bunları sızıntı denetimli kronolojik bir protokolle değerlendirdik. Uygulanan ve deneysel olarak değerlendirilenler: yeniden kurulan veri kümesi, D-1 hava özellikleri, geçmiş ve gün içi özellikler, ablasyonlar, SHAP açıklamaları, dört başka algoritmayla karşılaştırma, göreli maliyet analizi ve aylık kararlılık. Sonuçlar orta düzeyde tahmin edilebilirlik göstermektedir: iptal PR-AUC 0,119-0,196 (bilgisiz taban 0,029), neden doğruluğu %70,7-%73,9 (taban %60,2) ve dört sınıflı gecikme doğruluğu %60,8-%61,9 (taban %60,0). Uygulanan ancak değerlendirilmeyen: tahminleri kullanıcılara sunan SmartTicket web prototipi. Planlanan ve uygulanmayan: gerçek zamanlı ve saatlik hava durumu ile tahmin entegrasyonu, derin dizi modelleri, bir kullanıcı çalışması, önerilen üç aylık yeniden eğitim döngüsü ve ek yıllarda ve bölgelerde doğrulama. Sistem için ileri sürülen iddialar okunurken bu ayrımlar akılda tutulmalıdır.</w:t>
+        <w:t xml:space="preserve">Sonuç. Uçuş iptali, iptal nedeni ve kalkış gecikmesi sınıfı için XGBoost tabanlı üç model kurduk ve bunları sızıntı denetimli kronolojik bir protokolle değerlendirdik. Uygulanan ve deneysel olarak değerlendirilenler: yeniden kurulan veri kümesi, D-1 hava özellikleri, geçmiş ve gün içi özellikler, ablasyonlar, SHAP açıklamaları, dört başka algoritmayla karşılaştırma, göreli maliyet analizi ve aylık kararlılık. Sonuçlar orta düzeyde tahmin edilebilirlik göstermektedir: iptal PR-AUC 0,119-0,180 (bilgisiz taban 0,029), neden doğruluğu %70,7-%75,0 (taban %60,2) ve dört sınıflı gecikme doğruluğu %60,8-%61,9 (taban %60,0). Uygulanan ancak değerlendirilmeyen: tahminleri kullanıcılara sunan SmartTicket web prototipi. Planlanan ve uygulanmayan: gerçek zamanlı ve saatlik hava durumu ile tahmin entegrasyonu, derin dizi modelleri, bir kullanıcı çalışması, önerilen üç aylık yeniden eğitim döngüsü ve ek yıllarda ve bölgelerde doğrulama. Sistem için ileri sürülen iddialar okunurken bu ayrımlar akılda tutulmalıdır.</w:t>
       </w:r>
     </w:p>
     <w:p>

</xml_diff>